<commit_message>
Add token vs. payload persistence section to project documentation
New subsection in Part 6 explaining that the payment payload (merchant,
amount) never actually travels between the dashboard, picker webpage,
and bank app — only the opaque token does, copied verbatim from URL to
URL at each hop, while every participant independently re-fetches the
real payload fresh from the server using that token.
</commit_message>
<xml_diff>
--- a/SGQR_Complete_Project_Documentation.docx
+++ b/SGQR_Complete_Project_Documentation.docx
@@ -1875,6 +1875,482 @@
         <w:t xml:space="preserve">Tapping Approve calls POST /api/payload/:token/pay. A success response deducts the amount from a simple in-memory balance and shows the Success screen; a 409 response (another bank already paid it) shows "already completed" instead.</w:t>
       </w:r>
     </w:p>
+    <w:p>
+      <w:pPr>
+        <w:pStyle w:val="Heading2"/>
+        <w:spacing w:after="150" w:before="300"/>
+      </w:pPr>
+      <w:r>
+        <w:t xml:space="preserve">How the payload actually travels: token vs. data</w:t>
+      </w:r>
+    </w:p>
+    <w:p>
+      <w:pPr>
+        <w:spacing w:after="160"/>
+      </w:pPr>
+      <w:r>
+        <w:rPr>
+          <w:rFonts w:ascii="Calibri" w:cs="Calibri" w:eastAsia="Calibri" w:hAnsi="Calibri"/>
+          <w:sz w:val="22"/>
+          <w:szCs w:val="22"/>
+        </w:rPr>
+        <w:t xml:space="preserve">A natural question: the dashboard page, the picker/"app drawer" webpage, and the bank app are three completely separate programs — how does the payment information get from one to the next? The short answer is that it doesn't. Only the token travels between them; the real payload (merchant name, amount) is independently re-fetched from the server at every single hop.</w:t>
+      </w:r>
+    </w:p>
+    <w:tbl>
+      <w:tblPr>
+        <w:tblW w:type="dxa" w:w="9400"/>
+        <w:tblBorders>
+          <w:top w:val="single" w:color="auto" w:sz="4"/>
+          <w:left w:val="single" w:color="auto" w:sz="4"/>
+          <w:bottom w:val="single" w:color="auto" w:sz="4"/>
+          <w:right w:val="single" w:color="auto" w:sz="4"/>
+          <w:insideH w:val="single" w:color="auto" w:sz="4"/>
+          <w:insideV w:val="single" w:color="auto" w:sz="4"/>
+        </w:tblBorders>
+      </w:tblPr>
+      <w:tblGrid>
+        <w:gridCol w:w="2600"/>
+        <w:gridCol w:w="6800"/>
+      </w:tblGrid>
+      <w:tr>
+        <w:trPr>
+          <w:tblHeader/>
+        </w:trPr>
+        <w:tc>
+          <w:tcPr>
+            <w:tcW w:type="dxa" w:w="2600"/>
+            <w:shd w:fill="21295C" w:val="clear"/>
+            <w:tcMar>
+              <w:top w:type="dxa" w:w="100"/>
+              <w:left w:type="dxa" w:w="120"/>
+              <w:bottom w:type="dxa" w:w="100"/>
+              <w:right w:type="dxa" w:w="120"/>
+            </w:tcMar>
+            <w:vAlign w:val="top"/>
+          </w:tcPr>
+          <w:p>
+            <w:r>
+              <w:rPr>
+                <w:rFonts w:ascii="Calibri" w:cs="Calibri" w:eastAsia="Calibri" w:hAnsi="Calibri"/>
+                <w:b/>
+                <w:bCs/>
+                <w:color w:val="FFFFFF"/>
+                <w:sz w:val="20"/>
+                <w:szCs w:val="20"/>
+              </w:rPr>
+              <w:t xml:space="preserve">Hop</w:t>
+            </w:r>
+          </w:p>
+        </w:tc>
+        <w:tc>
+          <w:tcPr>
+            <w:tcW w:type="dxa" w:w="6800"/>
+            <w:shd w:fill="21295C" w:val="clear"/>
+            <w:tcMar>
+              <w:top w:type="dxa" w:w="100"/>
+              <w:left w:type="dxa" w:w="120"/>
+              <w:bottom w:type="dxa" w:w="100"/>
+              <w:right w:type="dxa" w:w="120"/>
+            </w:tcMar>
+            <w:vAlign w:val="top"/>
+          </w:tcPr>
+          <w:p>
+            <w:r>
+              <w:rPr>
+                <w:rFonts w:ascii="Calibri" w:cs="Calibri" w:eastAsia="Calibri" w:hAnsi="Calibri"/>
+                <w:b/>
+                <w:bCs/>
+                <w:color w:val="FFFFFF"/>
+                <w:sz w:val="20"/>
+                <w:szCs w:val="20"/>
+              </w:rPr>
+              <w:t xml:space="preserve">What actually happens</w:t>
+            </w:r>
+          </w:p>
+        </w:tc>
+      </w:tr>
+      <w:tr>
+        <w:tc>
+          <w:tcPr>
+            <w:tcW w:type="dxa" w:w="2600"/>
+            <w:tcMar>
+              <w:top w:type="dxa" w:w="100"/>
+              <w:left w:type="dxa" w:w="120"/>
+              <w:bottom w:type="dxa" w:w="100"/>
+              <w:right w:type="dxa" w:w="120"/>
+            </w:tcMar>
+            <w:vAlign w:val="top"/>
+          </w:tcPr>
+          <w:p>
+            <w:r>
+              <w:rPr>
+                <w:rFonts w:ascii="Calibri" w:cs="Calibri" w:eastAsia="Calibri" w:hAnsi="Calibri"/>
+                <w:b/>
+                <w:bCs/>
+                <w:color w:val="1A2233"/>
+                <w:sz w:val="20"/>
+                <w:szCs w:val="20"/>
+              </w:rPr>
+              <w:t xml:space="preserve">1. Dashboard creates the payment</w:t>
+            </w:r>
+          </w:p>
+        </w:tc>
+        <w:tc>
+          <w:tcPr>
+            <w:tcW w:type="dxa" w:w="6800"/>
+            <w:tcMar>
+              <w:top w:type="dxa" w:w="100"/>
+              <w:left w:type="dxa" w:w="120"/>
+              <w:bottom w:type="dxa" w:w="100"/>
+              <w:right w:type="dxa" w:w="120"/>
+            </w:tcMar>
+            <w:vAlign w:val="top"/>
+          </w:tcPr>
+          <w:p>
+            <w:r>
+              <w:rPr>
+                <w:rFonts w:ascii="Calibri" w:cs="Calibri" w:eastAsia="Calibri" w:hAnsi="Calibri"/>
+                <w:b w:val="false"/>
+                <w:bCs w:val="false"/>
+                <w:color w:val="1A2233"/>
+                <w:sz w:val="20"/>
+                <w:szCs w:val="20"/>
+              </w:rPr>
+              <w:t xml:space="preserve">POST /api/payments stores merchant + amount in the server's in-memory store and returns a token. From this point on, the payload lives only on the server.</w:t>
+            </w:r>
+          </w:p>
+        </w:tc>
+      </w:tr>
+      <w:tr>
+        <w:tc>
+          <w:tcPr>
+            <w:tcW w:type="dxa" w:w="2600"/>
+            <w:shd w:fill="F5F8FA" w:val="clear"/>
+            <w:tcMar>
+              <w:top w:type="dxa" w:w="100"/>
+              <w:left w:type="dxa" w:w="120"/>
+              <w:bottom w:type="dxa" w:w="100"/>
+              <w:right w:type="dxa" w:w="120"/>
+            </w:tcMar>
+            <w:vAlign w:val="top"/>
+          </w:tcPr>
+          <w:p>
+            <w:r>
+              <w:rPr>
+                <w:rFonts w:ascii="Calibri" w:cs="Calibri" w:eastAsia="Calibri" w:hAnsi="Calibri"/>
+                <w:b/>
+                <w:bCs/>
+                <w:color w:val="1A2233"/>
+                <w:sz w:val="20"/>
+                <w:szCs w:val="20"/>
+              </w:rPr>
+              <w:t xml:space="preserve">2. The QR code</w:t>
+            </w:r>
+          </w:p>
+        </w:tc>
+        <w:tc>
+          <w:tcPr>
+            <w:tcW w:type="dxa" w:w="6800"/>
+            <w:shd w:fill="F5F8FA" w:val="clear"/>
+            <w:tcMar>
+              <w:top w:type="dxa" w:w="100"/>
+              <w:left w:type="dxa" w:w="120"/>
+              <w:bottom w:type="dxa" w:w="100"/>
+              <w:right w:type="dxa" w:w="120"/>
+            </w:tcMar>
+            <w:vAlign w:val="top"/>
+          </w:tcPr>
+          <w:p>
+            <w:r>
+              <w:rPr>
+                <w:rFonts w:ascii="Calibri" w:cs="Calibri" w:eastAsia="Calibri" w:hAnsi="Calibri"/>
+                <w:b w:val="false"/>
+                <w:bCs w:val="false"/>
+                <w:color w:val="1A2233"/>
+                <w:sz w:val="20"/>
+                <w:szCs w:val="20"/>
+              </w:rPr>
+              <w:t xml:space="preserve">Encodes only https://.../pay/:token — no merchant name, no amount, just the opaque token.</w:t>
+            </w:r>
+          </w:p>
+        </w:tc>
+      </w:tr>
+      <w:tr>
+        <w:tc>
+          <w:tcPr>
+            <w:tcW w:type="dxa" w:w="2600"/>
+            <w:tcMar>
+              <w:top w:type="dxa" w:w="100"/>
+              <w:left w:type="dxa" w:w="120"/>
+              <w:bottom w:type="dxa" w:w="100"/>
+              <w:right w:type="dxa" w:w="120"/>
+            </w:tcMar>
+            <w:vAlign w:val="top"/>
+          </w:tcPr>
+          <w:p>
+            <w:r>
+              <w:rPr>
+                <w:rFonts w:ascii="Calibri" w:cs="Calibri" w:eastAsia="Calibri" w:hAnsi="Calibri"/>
+                <w:b/>
+                <w:bCs/>
+                <w:color w:val="1A2233"/>
+                <w:sz w:val="20"/>
+                <w:szCs w:val="20"/>
+              </w:rPr>
+              <w:t xml:space="preserve">3. Picker page (pay.html) loads</w:t>
+            </w:r>
+          </w:p>
+        </w:tc>
+        <w:tc>
+          <w:tcPr>
+            <w:tcW w:type="dxa" w:w="6800"/>
+            <w:tcMar>
+              <w:top w:type="dxa" w:w="100"/>
+              <w:left w:type="dxa" w:w="120"/>
+              <w:bottom w:type="dxa" w:w="100"/>
+              <w:right w:type="dxa" w:w="120"/>
+            </w:tcMar>
+            <w:vAlign w:val="top"/>
+          </w:tcPr>
+          <w:p>
+            <w:r>
+              <w:rPr>
+                <w:rFonts w:ascii="Calibri" w:cs="Calibri" w:eastAsia="Calibri" w:hAnsi="Calibri"/>
+                <w:b w:val="false"/>
+                <w:bCs w:val="false"/>
+                <w:color w:val="1A2233"/>
+                <w:sz w:val="20"/>
+                <w:szCs w:val="20"/>
+              </w:rPr>
+              <w:t xml:space="preserve">Reads the token out of its own URL, then calls GET /api/payload/:token to fetch merchant/amount fresh. This is a brand-new page load with no memory of the dashboard page at all.</w:t>
+            </w:r>
+          </w:p>
+        </w:tc>
+      </w:tr>
+      <w:tr>
+        <w:tc>
+          <w:tcPr>
+            <w:tcW w:type="dxa" w:w="2600"/>
+            <w:shd w:fill="F5F8FA" w:val="clear"/>
+            <w:tcMar>
+              <w:top w:type="dxa" w:w="100"/>
+              <w:left w:type="dxa" w:w="120"/>
+              <w:bottom w:type="dxa" w:w="100"/>
+              <w:right w:type="dxa" w:w="120"/>
+            </w:tcMar>
+            <w:vAlign w:val="top"/>
+          </w:tcPr>
+          <w:p>
+            <w:r>
+              <w:rPr>
+                <w:rFonts w:ascii="Calibri" w:cs="Calibri" w:eastAsia="Calibri" w:hAnsi="Calibri"/>
+                <w:b/>
+                <w:bCs/>
+                <w:color w:val="1A2233"/>
+                <w:sz w:val="20"/>
+                <w:szCs w:val="20"/>
+              </w:rPr>
+              <w:t xml:space="preserve">4. Android's "Continue to pay" hop</w:t>
+            </w:r>
+          </w:p>
+        </w:tc>
+        <w:tc>
+          <w:tcPr>
+            <w:tcW w:type="dxa" w:w="6800"/>
+            <w:shd w:fill="F5F8FA" w:val="clear"/>
+            <w:tcMar>
+              <w:top w:type="dxa" w:w="100"/>
+              <w:left w:type="dxa" w:w="120"/>
+              <w:bottom w:type="dxa" w:w="100"/>
+              <w:right w:type="dxa" w:w="120"/>
+            </w:tcMar>
+            <w:vAlign w:val="top"/>
+          </w:tcPr>
+          <w:p>
+            <w:r>
+              <w:rPr>
+                <w:rFonts w:ascii="Calibri" w:cs="Calibri" w:eastAsia="Calibri" w:hAnsi="Calibri"/>
+                <w:b w:val="false"/>
+                <w:bCs w:val="false"/>
+                <w:color w:val="1A2233"/>
+                <w:sz w:val="20"/>
+                <w:szCs w:val="20"/>
+              </w:rPr>
+              <w:t xml:space="preserve">The identical token is copied into a new intent:// URL (scheme=sgqrpay). This is a hand-off of the identifier only, not the payment data.</w:t>
+            </w:r>
+          </w:p>
+        </w:tc>
+      </w:tr>
+      <w:tr>
+        <w:tc>
+          <w:tcPr>
+            <w:tcW w:type="dxa" w:w="2600"/>
+            <w:tcMar>
+              <w:top w:type="dxa" w:w="100"/>
+              <w:left w:type="dxa" w:w="120"/>
+              <w:bottom w:type="dxa" w:w="100"/>
+              <w:right w:type="dxa" w:w="120"/>
+            </w:tcMar>
+            <w:vAlign w:val="top"/>
+          </w:tcPr>
+          <w:p>
+            <w:r>
+              <w:rPr>
+                <w:rFonts w:ascii="Calibri" w:cs="Calibri" w:eastAsia="Calibri" w:hAnsi="Calibri"/>
+                <w:b/>
+                <w:bCs/>
+                <w:color w:val="1A2233"/>
+                <w:sz w:val="20"/>
+                <w:szCs w:val="20"/>
+              </w:rPr>
+              <w:t xml:space="preserve">5. The bank app receives the link</w:t>
+            </w:r>
+          </w:p>
+        </w:tc>
+        <w:tc>
+          <w:tcPr>
+            <w:tcW w:type="dxa" w:w="6800"/>
+            <w:tcMar>
+              <w:top w:type="dxa" w:w="100"/>
+              <w:left w:type="dxa" w:w="120"/>
+              <w:bottom w:type="dxa" w:w="100"/>
+              <w:right w:type="dxa" w:w="120"/>
+            </w:tcMar>
+            <w:vAlign w:val="top"/>
+          </w:tcPr>
+          <w:p>
+            <w:r>
+              <w:rPr>
+                <w:rFonts w:ascii="Calibri" w:cs="Calibri" w:eastAsia="Calibri" w:hAnsi="Calibri"/>
+                <w:b w:val="false"/>
+                <w:bCs w:val="false"/>
+                <w:color w:val="1A2233"/>
+                <w:sz w:val="20"/>
+                <w:szCs w:val="20"/>
+              </w:rPr>
+              <w:t xml:space="preserve">app_links extracts the token from whichever URL shape arrived — a query parameter for a custom-scheme link, or the last path segment for a universal-link-style one.</w:t>
+            </w:r>
+          </w:p>
+        </w:tc>
+      </w:tr>
+      <w:tr>
+        <w:tc>
+          <w:tcPr>
+            <w:tcW w:type="dxa" w:w="2600"/>
+            <w:shd w:fill="F5F8FA" w:val="clear"/>
+            <w:tcMar>
+              <w:top w:type="dxa" w:w="100"/>
+              <w:left w:type="dxa" w:w="120"/>
+              <w:bottom w:type="dxa" w:w="100"/>
+              <w:right w:type="dxa" w:w="120"/>
+            </w:tcMar>
+            <w:vAlign w:val="top"/>
+          </w:tcPr>
+          <w:p>
+            <w:r>
+              <w:rPr>
+                <w:rFonts w:ascii="Calibri" w:cs="Calibri" w:eastAsia="Calibri" w:hAnsi="Calibri"/>
+                <w:b/>
+                <w:bCs/>
+                <w:color w:val="1A2233"/>
+                <w:sz w:val="20"/>
+                <w:szCs w:val="20"/>
+              </w:rPr>
+              <w:t xml:space="preserve">6. The bank app confirms</w:t>
+            </w:r>
+          </w:p>
+        </w:tc>
+        <w:tc>
+          <w:tcPr>
+            <w:tcW w:type="dxa" w:w="6800"/>
+            <w:shd w:fill="F5F8FA" w:val="clear"/>
+            <w:tcMar>
+              <w:top w:type="dxa" w:w="100"/>
+              <w:left w:type="dxa" w:w="120"/>
+              <w:bottom w:type="dxa" w:w="100"/>
+              <w:right w:type="dxa" w:w="120"/>
+            </w:tcMar>
+            <w:vAlign w:val="top"/>
+          </w:tcPr>
+          <w:p>
+            <w:r>
+              <w:rPr>
+                <w:rFonts w:ascii="Calibri" w:cs="Calibri" w:eastAsia="Calibri" w:hAnsi="Calibri"/>
+                <w:b w:val="false"/>
+                <w:bCs w:val="false"/>
+                <w:color w:val="1A2233"/>
+                <w:sz w:val="20"/>
+                <w:szCs w:val="20"/>
+              </w:rPr>
+              <w:t xml:space="preserve">Calls GET /api/payload/:token itself, independently, to populate its own Confirm screen — its own fresh fetch, not data passed down from any earlier screen.</w:t>
+            </w:r>
+          </w:p>
+        </w:tc>
+      </w:tr>
+    </w:tbl>
+    <w:p>
+      <w:pPr>
+        <w:spacing w:after="200"/>
+      </w:pPr>
+    </w:p>
+    <w:tbl>
+      <w:tblPr>
+        <w:tblW w:type="dxa" w:w="9400"/>
+        <w:tblBorders>
+          <w:top w:val="single" w:color="auto" w:sz="4"/>
+          <w:left w:val="single" w:color="auto" w:sz="4"/>
+          <w:bottom w:val="single" w:color="auto" w:sz="4"/>
+          <w:right w:val="single" w:color="auto" w:sz="4"/>
+          <w:insideH w:val="single" w:color="auto" w:sz="4"/>
+          <w:insideV w:val="single" w:color="auto" w:sz="4"/>
+        </w:tblBorders>
+      </w:tblPr>
+      <w:tblGrid>
+        <w:gridCol w:w="9400"/>
+      </w:tblGrid>
+      <w:tr>
+        <w:tc>
+          <w:tcPr>
+            <w:tcW w:type="dxa" w:w="9400"/>
+            <w:shd w:fill="E8F5F0" w:val="clear"/>
+            <w:tcMar>
+              <w:top w:type="dxa" w:w="160"/>
+              <w:left w:type="dxa" w:w="200"/>
+              <w:bottom w:type="dxa" w:w="160"/>
+              <w:right w:type="dxa" w:w="200"/>
+            </w:tcMar>
+          </w:tcPr>
+          <w:p>
+            <w:pPr>
+              <w:spacing w:after="80"/>
+            </w:pPr>
+            <w:r>
+              <w:rPr>
+                <w:rFonts w:ascii="Calibri" w:cs="Calibri" w:eastAsia="Calibri" w:hAnsi="Calibri"/>
+                <w:b/>
+                <w:bCs/>
+                <w:color w:val="0B3B44"/>
+                <w:sz w:val="22"/>
+                <w:szCs w:val="22"/>
+              </w:rPr>
+              <w:t xml:space="preserve">What actually persists</w:t>
+            </w:r>
+          </w:p>
+          <w:p>
+            <w:r>
+              <w:rPr>
+                <w:rFonts w:ascii="Calibri" w:cs="Calibri" w:eastAsia="Calibri" w:hAnsi="Calibri"/>
+                <w:color w:val="1A2233"/>
+                <w:sz w:val="21"/>
+                <w:szCs w:val="21"/>
+              </w:rPr>
+              <w:t xml:space="preserve">Only the token persists — and it does so purely by being copied verbatim from URL to URL at each hop, never through any shared storage, cookie, or session. The real payload is single-source-of-truth in the backend's store and is re-fetched fresh by every participant, every time. Nothing beyond the token is ever trusted from a link itself, which is also why a tampered or guessed link can't be used to alter what a payment actually charges.</w:t>
+            </w:r>
+          </w:p>
+        </w:tc>
+      </w:tr>
+    </w:tbl>
     <w:p>
       <w:r>
         <w:br w:type="page"/>

</xml_diff>

<commit_message>
Document all 5 additional deep-linking methods in deck and Word doc
- Word doc: new Part 9 comparing all 6 methods (core approach + the 5
  new demo apps) with real device test results, renumbering Summary to
  Part 10.
- Deck: two new slides — a color-coded card grid of the 5 new methods,
  and a side-by-side breakdown of the two that are code-correct but
  blocked by a real external requirement (paid Apple Developer account,
  published App Store listing).
- Also includes the earlier "grid of bank tiles" wording fix to the
  sequence-diagram deck that was pending from prior work this session.

Co-Authored-By: Claude Sonnet 5 <noreply@anthropic.com>
</commit_message>
<xml_diff>
--- a/SGQR_Complete_Project_Documentation.docx
+++ b/SGQR_Complete_Project_Documentation.docx
@@ -915,7 +915,7 @@
           <w:sz w:val="22"/>
           <w:szCs w:val="22"/>
         </w:rPr>
-        <w:t xml:space="preserve">The webpage itself acts as the chooser — it fetches the payment details and displays 3 buttons, one per bank. Each button navigates to that bank's own individual custom scheme (e.g. bankademo://pay?token=...). iOS recognizes the scheme is claimed by an installed app and, after a system confirmation prompt, hands off to it directly.</w:t>
+        <w:t xml:space="preserve">The webpage itself acts as the chooser — it fetches the payment details and displays a 4-per-row grid of bank tiles, one per bank (Apple's Wallet/Cash App-style tile layout, not a plain list). Each tile navigates to that bank's own individual custom scheme (e.g. bankademo://pay?token=...). iOS recognizes the scheme is claimed by an installed app and, after a system confirmation prompt, hands off to it directly. Note: iOS/Safari deliberately gives web pages no API to check in advance which apps are installed (Apple blocks this as an anti-fingerprinting measure), so all bank tiles are always shown, even ones not installed — tapping an uninstalled bank's tile simply does nothing observable, the same failure mode as any other unhandled custom-scheme link.</w:t>
       </w:r>
     </w:p>
     <w:p>
@@ -929,6 +929,68 @@
           <w:szCs w:val="22"/>
         </w:rPr>
         <w:t xml:space="preserve">In both cases, the actual payment details (merchant name, amount) are never carried inside the link. The link only ever carries an opaque token; every screen fetches the real details fresh from the server before showing anything to the user.</w:t>
+      </w:r>
+    </w:p>
+    <w:p>
+      <w:pPr>
+        <w:spacing w:after="200" w:before="120"/>
+        <w:jc w:val="center"/>
+      </w:pPr>
+      <w:r>
+        <w:drawing>
+          <wp:inline distT="0" distB="0" distL="0" distR="0">
+            <wp:extent cx="5715000" cy="2752725"/>
+            <wp:effectExtent t="0" r="0" b="0" l="0"/>
+            <wp:docPr id="1" name="" descr="" title=""/>
+            <wp:cNvGraphicFramePr>
+              <a:graphicFrameLocks xmlns:a="http://schemas.openxmlformats.org/drawingml/2006/main" noChangeAspect="1"/>
+            </wp:cNvGraphicFramePr>
+            <a:graphic xmlns:a="http://schemas.openxmlformats.org/drawingml/2006/main">
+              <a:graphicData uri="http://schemas.openxmlformats.org/drawingml/2006/picture">
+                <pic:pic xmlns:pic="http://schemas.openxmlformats.org/drawingml/2006/picture">
+                  <pic:nvPicPr>
+                    <pic:cNvPr id="0" name="" descr=""/>
+                    <pic:cNvPicPr>
+                      <a:picLocks noChangeAspect="1" noChangeArrowheads="1"/>
+                    </pic:cNvPicPr>
+                  </pic:nvPicPr>
+                  <pic:blipFill>
+                    <a:blip r:embed="rId7" cstate="none"/>
+                    <a:srcRect/>
+                    <a:stretch>
+                      <a:fillRect/>
+                    </a:stretch>
+                  </pic:blipFill>
+                  <pic:spPr bwMode="auto">
+                    <a:xfrm>
+                      <a:off x="0" y="0"/>
+                      <a:ext cx="5715000" cy="2752725"/>
+                    </a:xfrm>
+                    <a:prstGeom prst="rect">
+                      <a:avLst/>
+                    </a:prstGeom>
+                  </pic:spPr>
+                </pic:pic>
+              </a:graphicData>
+            </a:graphic>
+          </wp:inline>
+        </w:drawing>
+      </w:r>
+    </w:p>
+    <w:p>
+      <w:pPr>
+        <w:spacing w:after="160"/>
+      </w:pPr>
+      <w:r>
+        <w:rPr>
+          <w:rFonts w:ascii="Calibri" w:cs="Calibri" w:eastAsia="Calibri" w:hAnsi="Calibri"/>
+          <w:i/>
+          <w:iCs/>
+          <w:color w:val="5B6B79"/>
+          <w:sz w:val="20"/>
+          <w:szCs w:val="20"/>
+        </w:rPr>
+        <w:t xml:space="preserve">Both columns start from the identical QR code and end with a specific bank app open — the branching happens entirely inside each OS's own link-handling policy, not in any code this project controls.</w:t>
       </w:r>
     </w:p>
     <w:p>
@@ -1588,6 +1650,68 @@
     </w:p>
     <w:p>
       <w:pPr>
+        <w:spacing w:after="200" w:before="120"/>
+        <w:jc w:val="center"/>
+      </w:pPr>
+      <w:r>
+        <w:drawing>
+          <wp:inline distT="0" distB="0" distL="0" distR="0">
+            <wp:extent cx="5905500" cy="2162175"/>
+            <wp:effectExtent t="0" r="0" b="0" l="0"/>
+            <wp:docPr id="1" name="" descr="" title=""/>
+            <wp:cNvGraphicFramePr>
+              <a:graphicFrameLocks xmlns:a="http://schemas.openxmlformats.org/drawingml/2006/main" noChangeAspect="1"/>
+            </wp:cNvGraphicFramePr>
+            <a:graphic xmlns:a="http://schemas.openxmlformats.org/drawingml/2006/main">
+              <a:graphicData uri="http://schemas.openxmlformats.org/drawingml/2006/picture">
+                <pic:pic xmlns:pic="http://schemas.openxmlformats.org/drawingml/2006/picture">
+                  <pic:nvPicPr>
+                    <pic:cNvPr id="0" name="" descr=""/>
+                    <pic:cNvPicPr>
+                      <a:picLocks noChangeAspect="1" noChangeArrowheads="1"/>
+                    </pic:cNvPicPr>
+                  </pic:nvPicPr>
+                  <pic:blipFill>
+                    <a:blip r:embed="rId8" cstate="none"/>
+                    <a:srcRect/>
+                    <a:stretch>
+                      <a:fillRect/>
+                    </a:stretch>
+                  </pic:blipFill>
+                  <pic:spPr bwMode="auto">
+                    <a:xfrm>
+                      <a:off x="0" y="0"/>
+                      <a:ext cx="5905500" cy="2162175"/>
+                    </a:xfrm>
+                    <a:prstGeom prst="rect">
+                      <a:avLst/>
+                    </a:prstGeom>
+                  </pic:spPr>
+                </pic:pic>
+              </a:graphicData>
+            </a:graphic>
+          </wp:inline>
+        </w:drawing>
+      </w:r>
+    </w:p>
+    <w:p>
+      <w:pPr>
+        <w:spacing w:after="160"/>
+      </w:pPr>
+      <w:r>
+        <w:rPr>
+          <w:rFonts w:ascii="Calibri" w:cs="Calibri" w:eastAsia="Calibri" w:hAnsi="Calibri"/>
+          <w:i/>
+          <w:iCs/>
+          <w:color w:val="5B6B79"/>
+          <w:sz w:val="20"/>
+          <w:szCs w:val="20"/>
+        </w:rPr>
+        <w:t xml:space="preserve">This atomic check-then-flip is what makes the payment genuinely single-use even if two different bank apps somehow both try to approve the same token — there is no timing window in which both requests can read paid === false.</w:t>
+      </w:r>
+    </w:p>
+    <w:p>
+      <w:pPr>
         <w:spacing w:after="120" w:before="240"/>
       </w:pPr>
       <w:r>
@@ -1617,7 +1741,7 @@
           <w:sz w:val="22"/>
           <w:szCs w:val="22"/>
         </w:rPr>
-        <w:t xml:space="preserve">Detects whether it's running on Android (via the browser's user-agent string) and shows either the "Continue to pay" button (Android) or the 3 bank buttons (iOS/desktop).</w:t>
+        <w:t xml:space="preserve">Detects whether it's running on Android (via the browser's user-agent string) and shows either the "Continue to pay" button (Android) or the grid of bank tiles, 4 per row (iOS/desktop).</w:t>
       </w:r>
     </w:p>
     <w:p>
@@ -1896,6 +2020,73 @@
         </w:rPr>
         <w:t xml:space="preserve">A natural question: the dashboard page, the picker/"app drawer" webpage, and the bank app are three completely separate programs — how does the payment information get from one to the next? The short answer is that it doesn't. Only the token travels between them; the real payload (merchant name, amount) is independently re-fetched from the server at every single hop.</w:t>
       </w:r>
+    </w:p>
+    <w:p>
+      <w:pPr>
+        <w:spacing w:after="200" w:before="120"/>
+        <w:jc w:val="center"/>
+      </w:pPr>
+      <w:r>
+        <w:drawing>
+          <wp:inline distT="0" distB="0" distL="0" distR="0">
+            <wp:extent cx="5905500" cy="2647950"/>
+            <wp:effectExtent t="0" r="0" b="0" l="0"/>
+            <wp:docPr id="1" name="" descr="" title=""/>
+            <wp:cNvGraphicFramePr>
+              <a:graphicFrameLocks xmlns:a="http://schemas.openxmlformats.org/drawingml/2006/main" noChangeAspect="1"/>
+            </wp:cNvGraphicFramePr>
+            <a:graphic xmlns:a="http://schemas.openxmlformats.org/drawingml/2006/main">
+              <a:graphicData uri="http://schemas.openxmlformats.org/drawingml/2006/picture">
+                <pic:pic xmlns:pic="http://schemas.openxmlformats.org/drawingml/2006/picture">
+                  <pic:nvPicPr>
+                    <pic:cNvPr id="0" name="" descr=""/>
+                    <pic:cNvPicPr>
+                      <a:picLocks noChangeAspect="1" noChangeArrowheads="1"/>
+                    </pic:cNvPicPr>
+                  </pic:nvPicPr>
+                  <pic:blipFill>
+                    <a:blip r:embed="rId9" cstate="none"/>
+                    <a:srcRect/>
+                    <a:stretch>
+                      <a:fillRect/>
+                    </a:stretch>
+                  </pic:blipFill>
+                  <pic:spPr bwMode="auto">
+                    <a:xfrm>
+                      <a:off x="0" y="0"/>
+                      <a:ext cx="5905500" cy="2647950"/>
+                    </a:xfrm>
+                    <a:prstGeom prst="rect">
+                      <a:avLst/>
+                    </a:prstGeom>
+                  </pic:spPr>
+                </pic:pic>
+              </a:graphicData>
+            </a:graphic>
+          </wp:inline>
+        </w:drawing>
+      </w:r>
+    </w:p>
+    <w:p>
+      <w:pPr>
+        <w:spacing w:after="160"/>
+      </w:pPr>
+      <w:r>
+        <w:rPr>
+          <w:rFonts w:ascii="Calibri" w:cs="Calibri" w:eastAsia="Calibri" w:hAnsi="Calibri"/>
+          <w:i/>
+          <w:iCs/>
+          <w:color w:val="5B6B79"/>
+          <w:sz w:val="20"/>
+          <w:szCs w:val="20"/>
+        </w:rPr>
+        <w:t xml:space="preserve">The diagram above traces one payment across every hop. Solid arrows are the only thing that actually moves between pages/apps — a token, copied verbatim. Dashed arrows are independent server round-trips: the picker page and the bank app each call GET /api/payload/:token on their own, fresh, with no memory of any earlier screen.</w:t>
+      </w:r>
+    </w:p>
+    <w:p>
+      <w:pPr>
+        <w:spacing w:after="200"/>
+      </w:pPr>
     </w:p>
     <w:tbl>
       <w:tblPr>
@@ -6817,6 +7008,73 @@
     </w:tbl>
     <w:p>
       <w:pPr>
+        <w:spacing w:after="200"/>
+      </w:pPr>
+    </w:p>
+    <w:p>
+      <w:pPr>
+        <w:spacing w:after="200" w:before="120"/>
+        <w:jc w:val="center"/>
+      </w:pPr>
+      <w:r>
+        <w:drawing>
+          <wp:inline distT="0" distB="0" distL="0" distR="0">
+            <wp:extent cx="5905500" cy="1943100"/>
+            <wp:effectExtent t="0" r="0" b="0" l="0"/>
+            <wp:docPr id="1" name="" descr="" title=""/>
+            <wp:cNvGraphicFramePr>
+              <a:graphicFrameLocks xmlns:a="http://schemas.openxmlformats.org/drawingml/2006/main" noChangeAspect="1"/>
+            </wp:cNvGraphicFramePr>
+            <a:graphic xmlns:a="http://schemas.openxmlformats.org/drawingml/2006/main">
+              <a:graphicData uri="http://schemas.openxmlformats.org/drawingml/2006/picture">
+                <pic:pic xmlns:pic="http://schemas.openxmlformats.org/drawingml/2006/picture">
+                  <pic:nvPicPr>
+                    <pic:cNvPr id="0" name="" descr=""/>
+                    <pic:cNvPicPr>
+                      <a:picLocks noChangeAspect="1" noChangeArrowheads="1"/>
+                    </pic:cNvPicPr>
+                  </pic:nvPicPr>
+                  <pic:blipFill>
+                    <a:blip r:embed="rId10" cstate="none"/>
+                    <a:srcRect/>
+                    <a:stretch>
+                      <a:fillRect/>
+                    </a:stretch>
+                  </pic:blipFill>
+                  <pic:spPr bwMode="auto">
+                    <a:xfrm>
+                      <a:off x="0" y="0"/>
+                      <a:ext cx="5905500" cy="1943100"/>
+                    </a:xfrm>
+                    <a:prstGeom prst="rect">
+                      <a:avLst/>
+                    </a:prstGeom>
+                  </pic:spPr>
+                </pic:pic>
+              </a:graphicData>
+            </a:graphic>
+          </wp:inline>
+        </w:drawing>
+      </w:r>
+    </w:p>
+    <w:p>
+      <w:pPr>
+        <w:spacing w:after="160"/>
+      </w:pPr>
+      <w:r>
+        <w:rPr>
+          <w:rFonts w:ascii="Calibri" w:cs="Calibri" w:eastAsia="Calibri" w:hAnsi="Calibri"/>
+          <w:i/>
+          <w:iCs/>
+          <w:color w:val="5B6B79"/>
+          <w:sz w:val="20"/>
+          <w:szCs w:val="20"/>
+        </w:rPr>
+        <w:t xml:space="preserve">The clickjacking risk above is the one fully resolved, tested mitigation in this table — every other row is an open or accepted risk.</w:t>
+      </w:r>
+    </w:p>
+    <w:p>
+      <w:pPr>
         <w:spacing w:after="300"/>
       </w:pPr>
     </w:p>
@@ -7215,7 +7473,7 @@
                 <w:sz w:val="20"/>
                 <w:szCs w:val="20"/>
               </w:rPr>
-              <w:t xml:space="preserve">If a user selects a bank whose app isn’t installed, both platforms currently fail with no clear in-app message explaining what happened (the earlier “not installed” detection logic was removed for being unreliable).</w:t>
+              <w:t xml:space="preserve">A reactive “is this app installed” check (tap a tile, then see whether the page gets backgrounded within a timeout) was built and tested on a real iPhone. It proved unreliable: a failed custom-scheme navigation can still trigger a transient visibilitychange, so the page cannot distinguish “opened” from “failed to open”. Confirmed live by uninstalling a bank app and observing its tile did not gray out.</w:t>
             </w:r>
           </w:p>
         </w:tc>
@@ -7241,7 +7499,7 @@
                 <w:sz w:val="20"/>
                 <w:szCs w:val="20"/>
               </w:rPr>
-              <w:t xml:space="preserve">Not currently handled. Could redirect to an app store listing or show a generic “couldn’t open that app” message as a future improvement.</w:t>
+              <w:t xml:space="preserve">Detection logic was fully removed. All bank tiles are always shown on both platforms; tapping an uninstalled bank’s tile silently does nothing, the same as any unhandled custom-scheme link. Could redirect to an app store listing as a future improvement instead of attempting client-side detection.</w:t>
             </w:r>
           </w:p>
         </w:tc>
@@ -7623,7 +7881,1013 @@
         <w:spacing w:after="200" w:before="400"/>
       </w:pPr>
       <w:r>
-        <w:t xml:space="preserve">Part 9 — Summary</w:t>
+        <w:t xml:space="preserve">Part 9 — Other Deep-Linking Methods Demonstrated</w:t>
+      </w:r>
+    </w:p>
+    <w:p>
+      <w:pPr>
+        <w:spacing w:after="160"/>
+      </w:pPr>
+      <w:r>
+        <w:rPr>
+          <w:rFonts w:ascii="Calibri" w:cs="Calibri" w:eastAsia="Calibri" w:hAnsi="Calibri"/>
+          <w:color w:val="1A2233"/>
+          <w:sz w:val="22"/>
+          <w:szCs w:val="22"/>
+        </w:rPr>
+        <w:t xml:space="preserve">Beyond the unregistered-link approach used for the core Android/iOS scenario, five additional deep-linking mechanisms were built and tested as their own minimal, standalone Flutter apps, each with a dedicated backend route under /methods/&lt;name&gt;/:token. The goal was a complete, hands-on comparison — every mechanism's real behavior, including its real limitations, verified on physical devices rather than just described theoretically.</w:t>
+      </w:r>
+    </w:p>
+    <w:p>
+      <w:pPr>
+        <w:spacing w:after="200"/>
+      </w:pPr>
+    </w:p>
+    <w:tbl>
+      <w:tblPr>
+        <w:tblW w:type="dxa" w:w="11200"/>
+        <w:tblBorders>
+          <w:top w:val="single" w:color="auto" w:sz="4"/>
+          <w:left w:val="single" w:color="auto" w:sz="4"/>
+          <w:bottom w:val="single" w:color="auto" w:sz="4"/>
+          <w:right w:val="single" w:color="auto" w:sz="4"/>
+          <w:insideH w:val="single" w:color="auto" w:sz="4"/>
+          <w:insideV w:val="single" w:color="auto" w:sz="4"/>
+        </w:tblBorders>
+      </w:tblPr>
+      <w:tblGrid>
+        <w:gridCol w:w="1500"/>
+        <w:gridCol w:w="2800"/>
+        <w:gridCol w:w="2200"/>
+        <w:gridCol w:w="1200"/>
+        <w:gridCol w:w="3500"/>
+      </w:tblGrid>
+      <w:tr>
+        <w:trPr>
+          <w:tblHeader/>
+        </w:trPr>
+        <w:tc>
+          <w:tcPr>
+            <w:tcW w:type="dxa" w:w="1500"/>
+            <w:shd w:fill="21295C" w:val="clear"/>
+            <w:tcMar>
+              <w:top w:type="dxa" w:w="100"/>
+              <w:left w:type="dxa" w:w="120"/>
+              <w:bottom w:type="dxa" w:w="100"/>
+              <w:right w:type="dxa" w:w="120"/>
+            </w:tcMar>
+            <w:vAlign w:val="top"/>
+          </w:tcPr>
+          <w:p>
+            <w:pPr/>
+            <w:r>
+              <w:rPr>
+                <w:rFonts w:ascii="Calibri" w:cs="Calibri" w:eastAsia="Calibri" w:hAnsi="Calibri"/>
+                <w:b/>
+                <w:bCs/>
+                <w:color w:val="FFFFFF"/>
+                <w:sz w:val="20"/>
+                <w:szCs w:val="20"/>
+              </w:rPr>
+              <w:t xml:space="preserve">Method</w:t>
+            </w:r>
+          </w:p>
+        </w:tc>
+        <w:tc>
+          <w:tcPr>
+            <w:tcW w:type="dxa" w:w="2800"/>
+            <w:shd w:fill="21295C" w:val="clear"/>
+            <w:tcMar>
+              <w:top w:type="dxa" w:w="100"/>
+              <w:left w:type="dxa" w:w="120"/>
+              <w:bottom w:type="dxa" w:w="100"/>
+              <w:right w:type="dxa" w:w="120"/>
+            </w:tcMar>
+            <w:vAlign w:val="top"/>
+          </w:tcPr>
+          <w:p>
+            <w:pPr/>
+            <w:r>
+              <w:rPr>
+                <w:rFonts w:ascii="Calibri" w:cs="Calibri" w:eastAsia="Calibri" w:hAnsi="Calibri"/>
+                <w:b/>
+                <w:bCs/>
+                <w:color w:val="FFFFFF"/>
+                <w:sz w:val="20"/>
+                <w:szCs w:val="20"/>
+              </w:rPr>
+              <w:t xml:space="preserve">How it works</w:t>
+            </w:r>
+          </w:p>
+        </w:tc>
+        <w:tc>
+          <w:tcPr>
+            <w:tcW w:type="dxa" w:w="2200"/>
+            <w:shd w:fill="21295C" w:val="clear"/>
+            <w:tcMar>
+              <w:top w:type="dxa" w:w="100"/>
+              <w:left w:type="dxa" w:w="120"/>
+              <w:bottom w:type="dxa" w:w="100"/>
+              <w:right w:type="dxa" w:w="120"/>
+            </w:tcMar>
+            <w:vAlign w:val="top"/>
+          </w:tcPr>
+          <w:p>
+            <w:pPr/>
+            <w:r>
+              <w:rPr>
+                <w:rFonts w:ascii="Calibri" w:cs="Calibri" w:eastAsia="Calibri" w:hAnsi="Calibri"/>
+                <w:b/>
+                <w:bCs/>
+                <w:color w:val="FFFFFF"/>
+                <w:sz w:val="20"/>
+                <w:szCs w:val="20"/>
+              </w:rPr>
+              <w:t xml:space="preserve">Verification / proof required</w:t>
+            </w:r>
+          </w:p>
+        </w:tc>
+        <w:tc>
+          <w:tcPr>
+            <w:tcW w:type="dxa" w:w="1200"/>
+            <w:shd w:fill="21295C" w:val="clear"/>
+            <w:tcMar>
+              <w:top w:type="dxa" w:w="100"/>
+              <w:left w:type="dxa" w:w="120"/>
+              <w:bottom w:type="dxa" w:w="100"/>
+              <w:right w:type="dxa" w:w="120"/>
+            </w:tcMar>
+            <w:vAlign w:val="top"/>
+          </w:tcPr>
+          <w:p>
+            <w:pPr/>
+            <w:r>
+              <w:rPr>
+                <w:rFonts w:ascii="Calibri" w:cs="Calibri" w:eastAsia="Calibri" w:hAnsi="Calibri"/>
+                <w:b/>
+                <w:bCs/>
+                <w:color w:val="FFFFFF"/>
+                <w:sz w:val="20"/>
+                <w:szCs w:val="20"/>
+              </w:rPr>
+              <w:t xml:space="preserve">Chooser bypassed?</w:t>
+            </w:r>
+          </w:p>
+        </w:tc>
+        <w:tc>
+          <w:tcPr>
+            <w:tcW w:type="dxa" w:w="3500"/>
+            <w:shd w:fill="21295C" w:val="clear"/>
+            <w:tcMar>
+              <w:top w:type="dxa" w:w="100"/>
+              <w:left w:type="dxa" w:w="120"/>
+              <w:bottom w:type="dxa" w:w="100"/>
+              <w:right w:type="dxa" w:w="120"/>
+            </w:tcMar>
+            <w:vAlign w:val="top"/>
+          </w:tcPr>
+          <w:p>
+            <w:pPr/>
+            <w:r>
+              <w:rPr>
+                <w:rFonts w:ascii="Calibri" w:cs="Calibri" w:eastAsia="Calibri" w:hAnsi="Calibri"/>
+                <w:b/>
+                <w:bCs/>
+                <w:color w:val="FFFFFF"/>
+                <w:sz w:val="20"/>
+                <w:szCs w:val="20"/>
+              </w:rPr>
+              <w:t xml:space="preserve">Tested result</w:t>
+            </w:r>
+          </w:p>
+        </w:tc>
+      </w:tr>
+      <w:tr>
+        <w:tc>
+          <w:tcPr>
+            <w:tcW w:type="dxa" w:w="1500"/>
+            <w:tcMar>
+              <w:top w:type="dxa" w:w="100"/>
+              <w:left w:type="dxa" w:w="120"/>
+              <w:bottom w:type="dxa" w:w="100"/>
+              <w:right w:type="dxa" w:w="120"/>
+            </w:tcMar>
+            <w:vAlign w:val="top"/>
+          </w:tcPr>
+          <w:p>
+            <w:pPr/>
+            <w:r>
+              <w:rPr>
+                <w:rFonts w:ascii="Calibri" w:cs="Calibri" w:eastAsia="Calibri" w:hAnsi="Calibri"/>
+                <w:b/>
+                <w:bCs/>
+                <w:color w:val="1A2233"/>
+                <w:sz w:val="20"/>
+                <w:szCs w:val="20"/>
+              </w:rPr>
+              <w:t xml:space="preserve">Unregistered link (this project's core approach)</w:t>
+            </w:r>
+          </w:p>
+        </w:tc>
+        <w:tc>
+          <w:tcPr>
+            <w:tcW w:type="dxa" w:w="2800"/>
+            <w:tcMar>
+              <w:top w:type="dxa" w:w="100"/>
+              <w:left w:type="dxa" w:w="120"/>
+              <w:bottom w:type="dxa" w:w="100"/>
+              <w:right w:type="dxa" w:w="120"/>
+            </w:tcMar>
+            <w:vAlign w:val="top"/>
+          </w:tcPr>
+          <w:p>
+            <w:pPr/>
+            <w:r>
+              <w:rPr>
+                <w:rFonts w:ascii="Calibri" w:cs="Calibri" w:eastAsia="Calibri" w:hAnsi="Calibri"/>
+                <w:color w:val="1A2233"/>
+                <w:sz w:val="20"/>
+                <w:szCs w:val="20"/>
+              </w:rPr>
+              <w:t xml:space="preserve">QR encodes an unverified https link. Android defers to the browser then an intent:// forced chooser; iOS falls through to Safari's bank-tile grid.</w:t>
+            </w:r>
+          </w:p>
+        </w:tc>
+        <w:tc>
+          <w:tcPr>
+            <w:tcW w:type="dxa" w:w="2200"/>
+            <w:tcMar>
+              <w:top w:type="dxa" w:w="100"/>
+              <w:left w:type="dxa" w:w="120"/>
+              <w:bottom w:type="dxa" w:w="100"/>
+              <w:right w:type="dxa" w:w="120"/>
+            </w:tcMar>
+            <w:vAlign w:val="top"/>
+          </w:tcPr>
+          <w:p>
+            <w:pPr/>
+            <w:r>
+              <w:rPr>
+                <w:rFonts w:ascii="Calibri" w:cs="Calibri" w:eastAsia="Calibri" w:hAnsi="Calibri"/>
+                <w:color w:val="1A2233"/>
+                <w:sz w:val="20"/>
+                <w:szCs w:val="20"/>
+              </w:rPr>
+              <w:t xml:space="preserve">None.</w:t>
+            </w:r>
+          </w:p>
+        </w:tc>
+        <w:tc>
+          <w:tcPr>
+            <w:tcW w:type="dxa" w:w="1200"/>
+            <w:tcMar>
+              <w:top w:type="dxa" w:w="100"/>
+              <w:left w:type="dxa" w:w="120"/>
+              <w:bottom w:type="dxa" w:w="100"/>
+              <w:right w:type="dxa" w:w="120"/>
+            </w:tcMar>
+            <w:vAlign w:val="top"/>
+          </w:tcPr>
+          <w:p>
+            <w:pPr/>
+            <w:r>
+              <w:rPr>
+                <w:rFonts w:ascii="Calibri" w:cs="Calibri" w:eastAsia="Calibri" w:hAnsi="Calibri"/>
+                <w:color w:val="1A2233"/>
+                <w:sz w:val="20"/>
+                <w:szCs w:val="20"/>
+              </w:rPr>
+              <w:t xml:space="preserve">No — the chooser/picker is the whole point.</w:t>
+            </w:r>
+          </w:p>
+        </w:tc>
+        <w:tc>
+          <w:tcPr>
+            <w:tcW w:type="dxa" w:w="3500"/>
+            <w:tcMar>
+              <w:top w:type="dxa" w:w="100"/>
+              <w:left w:type="dxa" w:w="120"/>
+              <w:bottom w:type="dxa" w:w="100"/>
+              <w:right w:type="dxa" w:w="120"/>
+            </w:tcMar>
+            <w:vAlign w:val="top"/>
+          </w:tcPr>
+          <w:p>
+            <w:pPr/>
+            <w:r>
+              <w:rPr>
+                <w:rFonts w:ascii="Calibri" w:cs="Calibri" w:eastAsia="Calibri" w:hAnsi="Calibri"/>
+                <w:color w:val="1A2233"/>
+                <w:sz w:val="20"/>
+                <w:szCs w:val="20"/>
+              </w:rPr>
+              <w:t xml:space="preserve">Tested extensively across this project; working end to end on both platforms.</w:t>
+            </w:r>
+          </w:p>
+        </w:tc>
+      </w:tr>
+      <w:tr>
+        <w:tc>
+          <w:tcPr>
+            <w:tcW w:type="dxa" w:w="1500"/>
+            <w:shd w:fill="F5F8FA" w:val="clear"/>
+            <w:tcMar>
+              <w:top w:type="dxa" w:w="100"/>
+              <w:left w:type="dxa" w:w="120"/>
+              <w:bottom w:type="dxa" w:w="100"/>
+              <w:right w:type="dxa" w:w="120"/>
+            </w:tcMar>
+            <w:vAlign w:val="top"/>
+          </w:tcPr>
+          <w:p>
+            <w:pPr/>
+            <w:r>
+              <w:rPr>
+                <w:rFonts w:ascii="Calibri" w:cs="Calibri" w:eastAsia="Calibri" w:hAnsi="Calibri"/>
+                <w:b/>
+                <w:bCs/>
+                <w:color w:val="1A2233"/>
+                <w:sz w:val="20"/>
+                <w:szCs w:val="20"/>
+              </w:rPr>
+              <w:t xml:space="preserve">Verified Android App Links (method_applinks)</w:t>
+            </w:r>
+          </w:p>
+        </w:tc>
+        <w:tc>
+          <w:tcPr>
+            <w:tcW w:type="dxa" w:w="2800"/>
+            <w:shd w:fill="F5F8FA" w:val="clear"/>
+            <w:tcMar>
+              <w:top w:type="dxa" w:w="100"/>
+              <w:left w:type="dxa" w:w="120"/>
+              <w:bottom w:type="dxa" w:w="100"/>
+              <w:right w:type="dxa" w:w="120"/>
+            </w:tcMar>
+            <w:vAlign w:val="top"/>
+          </w:tcPr>
+          <w:p>
+            <w:pPr/>
+            <w:r>
+              <w:rPr>
+                <w:rFonts w:ascii="Calibri" w:cs="Calibri" w:eastAsia="Calibri" w:hAnsi="Calibri"/>
+                <w:color w:val="1A2233"/>
+                <w:sz w:val="20"/>
+                <w:szCs w:val="20"/>
+              </w:rPr>
+              <w:t xml:space="preserve">android:autoVerify="true" plus a hosted assetlinks.json at /.well-known/assetlinks.json.</w:t>
+            </w:r>
+          </w:p>
+        </w:tc>
+        <w:tc>
+          <w:tcPr>
+            <w:tcW w:type="dxa" w:w="2200"/>
+            <w:shd w:fill="F5F8FA" w:val="clear"/>
+            <w:tcMar>
+              <w:top w:type="dxa" w:w="100"/>
+              <w:left w:type="dxa" w:w="120"/>
+              <w:bottom w:type="dxa" w:w="100"/>
+              <w:right w:type="dxa" w:w="120"/>
+            </w:tcMar>
+            <w:vAlign w:val="top"/>
+          </w:tcPr>
+          <w:p>
+            <w:pPr/>
+            <w:r>
+              <w:rPr>
+                <w:rFonts w:ascii="Calibri" w:cs="Calibri" w:eastAsia="Calibri" w:hAnsi="Calibri"/>
+                <w:color w:val="1A2233"/>
+                <w:sz w:val="20"/>
+                <w:szCs w:val="20"/>
+              </w:rPr>
+              <w:t xml:space="preserve">Proof of domain ownership via the app's signing certificate fingerprint.</w:t>
+            </w:r>
+          </w:p>
+        </w:tc>
+        <w:tc>
+          <w:tcPr>
+            <w:tcW w:type="dxa" w:w="1200"/>
+            <w:shd w:fill="F5F8FA" w:val="clear"/>
+            <w:tcMar>
+              <w:top w:type="dxa" w:w="100"/>
+              <w:left w:type="dxa" w:w="120"/>
+              <w:bottom w:type="dxa" w:w="100"/>
+              <w:right w:type="dxa" w:w="120"/>
+            </w:tcMar>
+            <w:vAlign w:val="top"/>
+          </w:tcPr>
+          <w:p>
+            <w:pPr/>
+            <w:r>
+              <w:rPr>
+                <w:rFonts w:ascii="Calibri" w:cs="Calibri" w:eastAsia="Calibri" w:hAnsi="Calibri"/>
+                <w:color w:val="1A2233"/>
+                <w:sz w:val="20"/>
+                <w:szCs w:val="20"/>
+              </w:rPr>
+              <w:t xml:space="preserve">Yes — chooser skipped entirely.</w:t>
+            </w:r>
+          </w:p>
+        </w:tc>
+        <w:tc>
+          <w:tcPr>
+            <w:tcW w:type="dxa" w:w="3500"/>
+            <w:shd w:fill="F5F8FA" w:val="clear"/>
+            <w:tcMar>
+              <w:top w:type="dxa" w:w="100"/>
+              <w:left w:type="dxa" w:w="120"/>
+              <w:bottom w:type="dxa" w:w="100"/>
+              <w:right w:type="dxa" w:w="120"/>
+            </w:tcMar>
+            <w:vAlign w:val="top"/>
+          </w:tcPr>
+          <w:p>
+            <w:pPr/>
+            <w:r>
+              <w:rPr>
+                <w:rFonts w:ascii="Calibri" w:cs="Calibri" w:eastAsia="Calibri" w:hAnsi="Calibri"/>
+                <w:color w:val="1A2233"/>
+                <w:sz w:val="20"/>
+                <w:szCs w:val="20"/>
+              </w:rPr>
+              <w:t xml:space="preserve">Tested live on a real Android device: verified via adb shell pm get-app-links, link opened the app directly with zero prompt.</w:t>
+            </w:r>
+          </w:p>
+        </w:tc>
+      </w:tr>
+      <w:tr>
+        <w:tc>
+          <w:tcPr>
+            <w:tcW w:type="dxa" w:w="1500"/>
+            <w:tcMar>
+              <w:top w:type="dxa" w:w="100"/>
+              <w:left w:type="dxa" w:w="120"/>
+              <w:bottom w:type="dxa" w:w="100"/>
+              <w:right w:type="dxa" w:w="120"/>
+            </w:tcMar>
+            <w:vAlign w:val="top"/>
+          </w:tcPr>
+          <w:p>
+            <w:pPr/>
+            <w:r>
+              <w:rPr>
+                <w:rFonts w:ascii="Calibri" w:cs="Calibri" w:eastAsia="Calibri" w:hAnsi="Calibri"/>
+                <w:b/>
+                <w:bCs/>
+                <w:color w:val="1A2233"/>
+                <w:sz w:val="20"/>
+                <w:szCs w:val="20"/>
+              </w:rPr>
+              <w:t xml:space="preserve">Verified iOS Universal Links (method_universallinks)</w:t>
+            </w:r>
+          </w:p>
+        </w:tc>
+        <w:tc>
+          <w:tcPr>
+            <w:tcW w:type="dxa" w:w="2800"/>
+            <w:tcMar>
+              <w:top w:type="dxa" w:w="100"/>
+              <w:left w:type="dxa" w:w="120"/>
+              <w:bottom w:type="dxa" w:w="100"/>
+              <w:right w:type="dxa" w:w="120"/>
+            </w:tcMar>
+            <w:vAlign w:val="top"/>
+          </w:tcPr>
+          <w:p>
+            <w:pPr/>
+            <w:r>
+              <w:rPr>
+                <w:rFonts w:ascii="Calibri" w:cs="Calibri" w:eastAsia="Calibri" w:hAnsi="Calibri"/>
+                <w:color w:val="1A2233"/>
+                <w:sz w:val="20"/>
+                <w:szCs w:val="20"/>
+              </w:rPr>
+              <w:t xml:space="preserve">Associated Domains entitlement plus a hosted apple-app-site-association at /.well-known/apple-app-site-association.</w:t>
+            </w:r>
+          </w:p>
+        </w:tc>
+        <w:tc>
+          <w:tcPr>
+            <w:tcW w:type="dxa" w:w="2200"/>
+            <w:tcMar>
+              <w:top w:type="dxa" w:w="100"/>
+              <w:left w:type="dxa" w:w="120"/>
+              <w:bottom w:type="dxa" w:w="100"/>
+              <w:right w:type="dxa" w:w="120"/>
+            </w:tcMar>
+            <w:vAlign w:val="top"/>
+          </w:tcPr>
+          <w:p>
+            <w:pPr/>
+            <w:r>
+              <w:rPr>
+                <w:rFonts w:ascii="Calibri" w:cs="Calibri" w:eastAsia="Calibri" w:hAnsi="Calibri"/>
+                <w:color w:val="1A2233"/>
+                <w:sz w:val="20"/>
+                <w:szCs w:val="20"/>
+              </w:rPr>
+              <w:t xml:space="preserve">Associated Domains capability, which requires a paid Apple Developer Program membership for real verification.</w:t>
+            </w:r>
+          </w:p>
+        </w:tc>
+        <w:tc>
+          <w:tcPr>
+            <w:tcW w:type="dxa" w:w="1200"/>
+            <w:tcMar>
+              <w:top w:type="dxa" w:w="100"/>
+              <w:left w:type="dxa" w:w="120"/>
+              <w:bottom w:type="dxa" w:w="100"/>
+              <w:right w:type="dxa" w:w="120"/>
+            </w:tcMar>
+            <w:vAlign w:val="top"/>
+          </w:tcPr>
+          <w:p>
+            <w:pPr/>
+            <w:r>
+              <w:rPr>
+                <w:rFonts w:ascii="Calibri" w:cs="Calibri" w:eastAsia="Calibri" w:hAnsi="Calibri"/>
+                <w:color w:val="1A2233"/>
+                <w:sz w:val="20"/>
+                <w:szCs w:val="20"/>
+              </w:rPr>
+              <w:t xml:space="preserve">Intended: yes.</w:t>
+            </w:r>
+          </w:p>
+        </w:tc>
+        <w:tc>
+          <w:tcPr>
+            <w:tcW w:type="dxa" w:w="3500"/>
+            <w:tcMar>
+              <w:top w:type="dxa" w:w="100"/>
+              <w:left w:type="dxa" w:w="120"/>
+              <w:bottom w:type="dxa" w:w="100"/>
+              <w:right w:type="dxa" w:w="120"/>
+            </w:tcMar>
+            <w:vAlign w:val="top"/>
+          </w:tcPr>
+          <w:p>
+            <w:pPr/>
+            <w:r>
+              <w:rPr>
+                <w:rFonts w:ascii="Calibri" w:cs="Calibri" w:eastAsia="Calibri" w:hAnsi="Calibri"/>
+                <w:color w:val="1A2233"/>
+                <w:sz w:val="20"/>
+                <w:szCs w:val="20"/>
+              </w:rPr>
+              <w:t xml:space="preserve">Tested on a real iPhone with a free Apple ID: entitlement was present in the signed binary (confirmed via codesign), but iOS never created the “Open Links” per-app Settings entry — verification never actually completed. Every test fell through to Safari with a manual “Open” banner instead of a silent handoff. A real, confirmed limitation of free-tier accounts, not a code bug.</w:t>
+            </w:r>
+          </w:p>
+        </w:tc>
+      </w:tr>
+      <w:tr>
+        <w:tc>
+          <w:tcPr>
+            <w:tcW w:type="dxa" w:w="1500"/>
+            <w:shd w:fill="F5F8FA" w:val="clear"/>
+            <w:tcMar>
+              <w:top w:type="dxa" w:w="100"/>
+              <w:left w:type="dxa" w:w="120"/>
+              <w:bottom w:type="dxa" w:w="100"/>
+              <w:right w:type="dxa" w:w="120"/>
+            </w:tcMar>
+            <w:vAlign w:val="top"/>
+          </w:tcPr>
+          <w:p>
+            <w:pPr/>
+            <w:r>
+              <w:rPr>
+                <w:rFonts w:ascii="Calibri" w:cs="Calibri" w:eastAsia="Calibri" w:hAnsi="Calibri"/>
+                <w:b/>
+                <w:bCs/>
+                <w:color w:val="1A2233"/>
+                <w:sz w:val="20"/>
+                <w:szCs w:val="20"/>
+              </w:rPr>
+              <w:t xml:space="preserve">iOS Smart App Banner (method_smartbanner)</w:t>
+            </w:r>
+          </w:p>
+        </w:tc>
+        <w:tc>
+          <w:tcPr>
+            <w:tcW w:type="dxa" w:w="2800"/>
+            <w:shd w:fill="F5F8FA" w:val="clear"/>
+            <w:tcMar>
+              <w:top w:type="dxa" w:w="100"/>
+              <w:left w:type="dxa" w:w="120"/>
+              <w:bottom w:type="dxa" w:w="100"/>
+              <w:right w:type="dxa" w:w="120"/>
+            </w:tcMar>
+            <w:vAlign w:val="top"/>
+          </w:tcPr>
+          <w:p>
+            <w:pPr/>
+            <w:r>
+              <w:rPr>
+                <w:rFonts w:ascii="Calibri" w:cs="Calibri" w:eastAsia="Calibri" w:hAnsi="Calibri"/>
+                <w:color w:val="1A2233"/>
+                <w:sz w:val="20"/>
+                <w:szCs w:val="20"/>
+              </w:rPr>
+              <w:t xml:space="preserve">A &lt;meta name="apple-itunes-app"&gt; tag on a webpage, carrying an app-id and an app-argument.</w:t>
+            </w:r>
+          </w:p>
+        </w:tc>
+        <w:tc>
+          <w:tcPr>
+            <w:tcW w:type="dxa" w:w="2200"/>
+            <w:shd w:fill="F5F8FA" w:val="clear"/>
+            <w:tcMar>
+              <w:top w:type="dxa" w:w="100"/>
+              <w:left w:type="dxa" w:w="120"/>
+              <w:bottom w:type="dxa" w:w="100"/>
+              <w:right w:type="dxa" w:w="120"/>
+            </w:tcMar>
+            <w:vAlign w:val="top"/>
+          </w:tcPr>
+          <w:p>
+            <w:pPr/>
+            <w:r>
+              <w:rPr>
+                <w:rFonts w:ascii="Calibri" w:cs="Calibri" w:eastAsia="Calibri" w:hAnsi="Calibri"/>
+                <w:color w:val="1A2233"/>
+                <w:sz w:val="20"/>
+                <w:szCs w:val="20"/>
+              </w:rPr>
+              <w:t xml:space="preserve">The app-id must match a real, published App Store listing — Apple validates this server-side, not just tag presence.</w:t>
+            </w:r>
+          </w:p>
+        </w:tc>
+        <w:tc>
+          <w:tcPr>
+            <w:tcW w:type="dxa" w:w="1200"/>
+            <w:shd w:fill="F5F8FA" w:val="clear"/>
+            <w:tcMar>
+              <w:top w:type="dxa" w:w="100"/>
+              <w:left w:type="dxa" w:w="120"/>
+              <w:bottom w:type="dxa" w:w="100"/>
+              <w:right w:type="dxa" w:w="120"/>
+            </w:tcMar>
+            <w:vAlign w:val="top"/>
+          </w:tcPr>
+          <w:p>
+            <w:pPr/>
+            <w:r>
+              <w:rPr>
+                <w:rFonts w:ascii="Calibri" w:cs="Calibri" w:eastAsia="Calibri" w:hAnsi="Calibri"/>
+                <w:color w:val="1A2233"/>
+                <w:sz w:val="20"/>
+                <w:szCs w:val="20"/>
+              </w:rPr>
+              <w:t xml:space="preserve">No entitlement needed, but the banner cannot render at all without a real listing.</w:t>
+            </w:r>
+          </w:p>
+        </w:tc>
+        <w:tc>
+          <w:tcPr>
+            <w:tcW w:type="dxa" w:w="3500"/>
+            <w:shd w:fill="F5F8FA" w:val="clear"/>
+            <w:tcMar>
+              <w:top w:type="dxa" w:w="100"/>
+              <w:left w:type="dxa" w:w="120"/>
+              <w:bottom w:type="dxa" w:w="100"/>
+              <w:right w:type="dxa" w:w="120"/>
+            </w:tcMar>
+            <w:vAlign w:val="top"/>
+          </w:tcPr>
+          <w:p>
+            <w:pPr/>
+            <w:r>
+              <w:rPr>
+                <w:rFonts w:ascii="Calibri" w:cs="Calibri" w:eastAsia="Calibri" w:hAnsi="Calibri"/>
+                <w:color w:val="1A2233"/>
+                <w:sz w:val="20"/>
+                <w:szCs w:val="20"/>
+              </w:rPr>
+              <w:t xml:space="preserve">Code and hosting confirmed correct and deployed, but the banner itself cannot appear for a sideloaded, unpublished app — a confirmed limitation, not testable further without publishing.</w:t>
+            </w:r>
+          </w:p>
+        </w:tc>
+      </w:tr>
+      <w:tr>
+        <w:tc>
+          <w:tcPr>
+            <w:tcW w:type="dxa" w:w="1500"/>
+            <w:tcMar>
+              <w:top w:type="dxa" w:w="100"/>
+              <w:left w:type="dxa" w:w="120"/>
+              <w:bottom w:type="dxa" w:w="100"/>
+              <w:right w:type="dxa" w:w="120"/>
+            </w:tcMar>
+            <w:vAlign w:val="top"/>
+          </w:tcPr>
+          <w:p>
+            <w:pPr/>
+            <w:r>
+              <w:rPr>
+                <w:rFonts w:ascii="Calibri" w:cs="Calibri" w:eastAsia="Calibri" w:hAnsi="Calibri"/>
+                <w:b/>
+                <w:bCs/>
+                <w:color w:val="1A2233"/>
+                <w:sz w:val="20"/>
+                <w:szCs w:val="20"/>
+              </w:rPr>
+              <w:t xml:space="preserve">Android explicit-package intent (method_explicit_intent)</w:t>
+            </w:r>
+          </w:p>
+        </w:tc>
+        <w:tc>
+          <w:tcPr>
+            <w:tcW w:type="dxa" w:w="2800"/>
+            <w:tcMar>
+              <w:top w:type="dxa" w:w="100"/>
+              <w:left w:type="dxa" w:w="120"/>
+              <w:bottom w:type="dxa" w:w="100"/>
+              <w:right w:type="dxa" w:w="120"/>
+            </w:tcMar>
+            <w:vAlign w:val="top"/>
+          </w:tcPr>
+          <w:p>
+            <w:pPr/>
+            <w:r>
+              <w:rPr>
+                <w:rFonts w:ascii="Calibri" w:cs="Calibri" w:eastAsia="Calibri" w:hAnsi="Calibri"/>
+                <w:color w:val="1A2233"/>
+                <w:sz w:val="20"/>
+                <w:szCs w:val="20"/>
+              </w:rPr>
+              <w:t xml:space="preserve">An intent:// link with package=com.sgqrdemo.method_explicit_intent named directly, removing all ambiguity.</w:t>
+            </w:r>
+          </w:p>
+        </w:tc>
+        <w:tc>
+          <w:tcPr>
+            <w:tcW w:type="dxa" w:w="2200"/>
+            <w:tcMar>
+              <w:top w:type="dxa" w:w="100"/>
+              <w:left w:type="dxa" w:w="120"/>
+              <w:bottom w:type="dxa" w:w="100"/>
+              <w:right w:type="dxa" w:w="120"/>
+            </w:tcMar>
+            <w:vAlign w:val="top"/>
+          </w:tcPr>
+          <w:p>
+            <w:pPr/>
+            <w:r>
+              <w:rPr>
+                <w:rFonts w:ascii="Calibri" w:cs="Calibri" w:eastAsia="Calibri" w:hAnsi="Calibri"/>
+                <w:color w:val="1A2233"/>
+                <w:sz w:val="20"/>
+                <w:szCs w:val="20"/>
+              </w:rPr>
+              <w:t xml:space="preserve">None — the sender states the answer instead of the OS verifying it.</w:t>
+            </w:r>
+          </w:p>
+        </w:tc>
+        <w:tc>
+          <w:tcPr>
+            <w:tcW w:type="dxa" w:w="1200"/>
+            <w:tcMar>
+              <w:top w:type="dxa" w:w="100"/>
+              <w:left w:type="dxa" w:w="120"/>
+              <w:bottom w:type="dxa" w:w="100"/>
+              <w:right w:type="dxa" w:w="120"/>
+            </w:tcMar>
+            <w:vAlign w:val="top"/>
+          </w:tcPr>
+          <w:p>
+            <w:pPr/>
+            <w:r>
+              <w:rPr>
+                <w:rFonts w:ascii="Calibri" w:cs="Calibri" w:eastAsia="Calibri" w:hAnsi="Calibri"/>
+                <w:color w:val="1A2233"/>
+                <w:sz w:val="20"/>
+                <w:szCs w:val="20"/>
+              </w:rPr>
+              <w:t xml:space="preserve">Yes — chooser skipped unconditionally.</w:t>
+            </w:r>
+          </w:p>
+        </w:tc>
+        <w:tc>
+          <w:tcPr>
+            <w:tcW w:type="dxa" w:w="3500"/>
+            <w:tcMar>
+              <w:top w:type="dxa" w:w="100"/>
+              <w:left w:type="dxa" w:w="120"/>
+              <w:bottom w:type="dxa" w:w="100"/>
+              <w:right w:type="dxa" w:w="120"/>
+            </w:tcMar>
+            <w:vAlign w:val="top"/>
+          </w:tcPr>
+          <w:p>
+            <w:pPr/>
+            <w:r>
+              <w:rPr>
+                <w:rFonts w:ascii="Calibri" w:cs="Calibri" w:eastAsia="Calibri" w:hAnsi="Calibri"/>
+                <w:color w:val="1A2233"/>
+                <w:sz w:val="20"/>
+                <w:szCs w:val="20"/>
+              </w:rPr>
+              <w:t xml:space="preserve">Tested live on a real Android device via adb: opened directly, zero prompt, correct payload fetched. Trade-off: only works when the link's generator already knows which app should open it — the opposite of this project's “any of 3 banks” scenario.</w:t>
+            </w:r>
+          </w:p>
+        </w:tc>
+      </w:tr>
+      <w:tr>
+        <w:tc>
+          <w:tcPr>
+            <w:tcW w:type="dxa" w:w="1500"/>
+            <w:shd w:fill="F5F8FA" w:val="clear"/>
+            <w:tcMar>
+              <w:top w:type="dxa" w:w="100"/>
+              <w:left w:type="dxa" w:w="120"/>
+              <w:bottom w:type="dxa" w:w="100"/>
+              <w:right w:type="dxa" w:w="120"/>
+            </w:tcMar>
+            <w:vAlign w:val="top"/>
+          </w:tcPr>
+          <w:p>
+            <w:pPr/>
+            <w:r>
+              <w:rPr>
+                <w:rFonts w:ascii="Calibri" w:cs="Calibri" w:eastAsia="Calibri" w:hAnsi="Calibri"/>
+                <w:b/>
+                <w:bCs/>
+                <w:color w:val="1A2233"/>
+                <w:sz w:val="20"/>
+                <w:szCs w:val="20"/>
+              </w:rPr>
+              <w:t xml:space="preserve">Deferred deep linking (method_deferred)</w:t>
+            </w:r>
+          </w:p>
+        </w:tc>
+        <w:tc>
+          <w:tcPr>
+            <w:tcW w:type="dxa" w:w="2800"/>
+            <w:shd w:fill="F5F8FA" w:val="clear"/>
+            <w:tcMar>
+              <w:top w:type="dxa" w:w="100"/>
+              <w:left w:type="dxa" w:w="120"/>
+              <w:bottom w:type="dxa" w:w="100"/>
+              <w:right w:type="dxa" w:w="120"/>
+            </w:tcMar>
+            <w:vAlign w:val="top"/>
+          </w:tcPr>
+          <w:p>
+            <w:pPr/>
+            <w:r>
+              <w:rPr>
+                <w:rFonts w:ascii="Calibri" w:cs="Calibri" w:eastAsia="Calibri" w:hAnsi="Calibri"/>
+                <w:color w:val="1A2233"/>
+                <w:sz w:val="20"/>
+                <w:szCs w:val="20"/>
+              </w:rPr>
+              <w:t xml:space="preserve">Real deferred linking relies on the App/Play Store carrying a click identifier through installation itself. Simulated here via a clipboard technique: the web fallback copies the destination URL before the (simulated) “install” step, and the app checks the clipboard once on first launch.</w:t>
+            </w:r>
+          </w:p>
+        </w:tc>
+        <w:tc>
+          <w:tcPr>
+            <w:tcW w:type="dxa" w:w="2200"/>
+            <w:shd w:fill="F5F8FA" w:val="clear"/>
+            <w:tcMar>
+              <w:top w:type="dxa" w:w="100"/>
+              <w:left w:type="dxa" w:w="120"/>
+              <w:bottom w:type="dxa" w:w="100"/>
+              <w:right w:type="dxa" w:w="120"/>
+            </w:tcMar>
+            <w:vAlign w:val="top"/>
+          </w:tcPr>
+          <w:p>
+            <w:pPr/>
+            <w:r>
+              <w:rPr>
+                <w:rFonts w:ascii="Calibri" w:cs="Calibri" w:eastAsia="Calibri" w:hAnsi="Calibri"/>
+                <w:color w:val="1A2233"/>
+                <w:sz w:val="20"/>
+                <w:szCs w:val="20"/>
+              </w:rPr>
+              <w:t xml:space="preserve">None — a client-side simulation, not App Store-backed.</w:t>
+            </w:r>
+          </w:p>
+        </w:tc>
+        <w:tc>
+          <w:tcPr>
+            <w:tcW w:type="dxa" w:w="1200"/>
+            <w:shd w:fill="F5F8FA" w:val="clear"/>
+            <w:tcMar>
+              <w:top w:type="dxa" w:w="100"/>
+              <w:left w:type="dxa" w:w="120"/>
+              <w:bottom w:type="dxa" w:w="100"/>
+              <w:right w:type="dxa" w:w="120"/>
+            </w:tcMar>
+            <w:vAlign w:val="top"/>
+          </w:tcPr>
+          <w:p>
+            <w:pPr/>
+            <w:r>
+              <w:rPr>
+                <w:rFonts w:ascii="Calibri" w:cs="Calibri" w:eastAsia="Calibri" w:hAnsi="Calibri"/>
+                <w:color w:val="1A2233"/>
+                <w:sz w:val="20"/>
+                <w:szCs w:val="20"/>
+              </w:rPr>
+              <w:t xml:space="preserve">N/A — this method is about post-install content routing, not chooser behavior.</w:t>
+            </w:r>
+          </w:p>
+        </w:tc>
+        <w:tc>
+          <w:tcPr>
+            <w:tcW w:type="dxa" w:w="3500"/>
+            <w:shd w:fill="F5F8FA" w:val="clear"/>
+            <w:tcMar>
+              <w:top w:type="dxa" w:w="100"/>
+              <w:left w:type="dxa" w:w="120"/>
+              <w:bottom w:type="dxa" w:w="100"/>
+              <w:right w:type="dxa" w:w="120"/>
+            </w:tcMar>
+            <w:vAlign w:val="top"/>
+          </w:tcPr>
+          <w:p>
+            <w:pPr/>
+            <w:r>
+              <w:rPr>
+                <w:rFonts w:ascii="Calibri" w:cs="Calibri" w:eastAsia="Calibri" w:hAnsi="Calibri"/>
+                <w:color w:val="1A2233"/>
+                <w:sz w:val="20"/>
+                <w:szCs w:val="20"/>
+              </w:rPr>
+              <w:t xml:space="preserve">Tested live on both a real Android device and a real iPhone: correctly recovered the token, merchant, and amount from the clipboard on first launch on both platforms.</w:t>
+            </w:r>
+          </w:p>
+        </w:tc>
+      </w:tr>
+    </w:tbl>
+    <w:p>
+      <w:pPr>
+        <w:spacing w:after="200"/>
+      </w:pPr>
+    </w:p>
+    <w:tbl>
+      <w:tblPr>
+        <w:tblW w:type="dxa" w:w="9400"/>
+      </w:tblPr>
+      <w:tblGrid>
+        <w:gridCol w:w="9400"/>
+      </w:tblGrid>
+      <w:tr>
+        <w:tc>
+          <w:tcPr>
+            <w:tcW w:type="dxa" w:w="9400"/>
+            <w:shd w:fill="FBF3E8" w:val="clear"/>
+            <w:tcMar>
+              <w:top w:type="dxa" w:w="160"/>
+              <w:left w:type="dxa" w:w="200"/>
+              <w:bottom w:type="dxa" w:w="160"/>
+              <w:right w:type="dxa" w:w="200"/>
+            </w:tcMar>
+          </w:tcPr>
+          <w:p>
+            <w:pPr>
+              <w:spacing w:after="80"/>
+            </w:pPr>
+            <w:r>
+              <w:rPr>
+                <w:rFonts w:ascii="Calibri" w:cs="Calibri" w:eastAsia="Calibri" w:hAnsi="Calibri"/>
+                <w:b/>
+                <w:bCs/>
+                <w:color w:val="8A5A00"/>
+                <w:sz w:val="22"/>
+                <w:szCs w:val="22"/>
+              </w:rPr>
+              <w:t xml:space="preserve">Why this matters</w:t>
+            </w:r>
+          </w:p>
+          <w:p>
+            <w:r>
+              <w:rPr>
+                <w:rFonts w:ascii="Calibri" w:cs="Calibri" w:eastAsia="Calibri" w:hAnsi="Calibri"/>
+                <w:color w:val="1A2233"/>
+                <w:sz w:val="21"/>
+                <w:szCs w:val="21"/>
+              </w:rPr>
+              <w:t xml:space="preserve">Two of these methods (Verified Universal Links and the Smart App Banner) look correct in code and configuration but cannot fully succeed in this project's environment — not due to a bug, but because of real platform requirements (a paid Apple Developer account, and a published App Store listing) that a sideloaded demo cannot meet. Documenting that distinction — “correct but blocked by an external requirement” versus “broken” — is itself one of the more useful outcomes of building all five.</w:t>
+            </w:r>
+          </w:p>
+        </w:tc>
+      </w:tr>
+    </w:tbl>
+    <w:p>
+      <w:r>
+        <w:br w:type="page"/>
+      </w:r>
+    </w:p>
+    <w:p>
+      <w:pPr>
+        <w:pStyle w:val="Heading1"/>
+        <w:spacing w:after="200" w:before="400"/>
+      </w:pPr>
+      <w:r>
+        <w:t xml:space="preserve">Part 10 — Summary</w:t>
       </w:r>
     </w:p>
     <w:p>

</xml_diff>

<commit_message>
Give Bank 1-5 a distinct color palette from Bank A/B/C
Bank 3 (iOS Smart App Banner) previously reused Bank C's exact color
(2A9D8F). New palette: Bank 1=6A4C93, Bank 2=118AB2, Bank 3=B5651D
(darker for white-text contrast), Bank 4=E07A5F, Bank 5=D81E5B — all
distinct from A/B/C's E63946/1D3557/2A9D8F and from each other.

Also updates the deck's method-grid and comparison slides to the same
palette and adds "Bank N —" labels, and adds a Bank N mapping table +
explanatory paragraph to the Word doc's Part 9.

Co-Authored-By: Claude Sonnet 5 <noreply@anthropic.com>
</commit_message>
<xml_diff>
--- a/SGQR_Complete_Project_Documentation.docx
+++ b/SGQR_Complete_Project_Documentation.docx
@@ -7900,6 +7900,19 @@
     </w:p>
     <w:p>
       <w:pPr>
+        <w:spacing w:after="160"/>
+      </w:pPr>
+      <w:r>
+        <w:rPr>
+          <w:rFonts w:ascii="Calibri" w:cs="Calibri" w:eastAsia="Calibri" w:hAnsi="Calibri"/>
+          <w:sz w:val="22"/>
+          <w:szCs w:val="22"/>
+        </w:rPr>
+        <w:t xml:space="preserve">Each of the 5 apps is visually branded the same way as bank_app_a/b/c — its own home screen with a mock balance, a confirm/approve screen, launcher icon in its own accent color — and named “Bank 1” through “Bank 5” to keep the naming pattern consistent, even though each demonstrates a mechanism rather than a distinct bank. Each app's home screen also shows a colored badge stating which platform(s) it actually works on (“Android only,” “iOS only,” or “Android + iOS”) — a reminder that, unlike the shared QR/link used by Bank A/B/C, these 5 mechanisms are platform-specific by nature, with the single exception of Bank 5's clipboard-based deferred linking, which works identically on both.</w:t>
+      </w:r>
+    </w:p>
+    <w:p>
+      <w:pPr>
         <w:spacing w:after="200"/>
       </w:pPr>
     </w:p>
@@ -8085,7 +8098,7 @@
                 <w:sz w:val="20"/>
                 <w:szCs w:val="20"/>
               </w:rPr>
-              <w:t xml:space="preserve">Unregistered link (this project's core approach)</w:t>
+              <w:t xml:space="preserve">Unregistered link (core approach — used by Bank A/B/C)</w:t>
             </w:r>
           </w:p>
         </w:tc>
@@ -8210,7 +8223,7 @@
                 <w:sz w:val="20"/>
                 <w:szCs w:val="20"/>
               </w:rPr>
-              <w:t xml:space="preserve">Verified Android App Links (method_applinks)</w:t>
+              <w:t xml:space="preserve">Bank 1 — Verified Android App Links (method_applinks)</w:t>
             </w:r>
           </w:p>
         </w:tc>
@@ -8338,7 +8351,7 @@
                 <w:sz w:val="20"/>
                 <w:szCs w:val="20"/>
               </w:rPr>
-              <w:t xml:space="preserve">Verified iOS Universal Links (method_universallinks)</w:t>
+              <w:t xml:space="preserve">Bank 2 — Verified iOS Universal Links (method_universallinks)</w:t>
             </w:r>
           </w:p>
         </w:tc>
@@ -8463,7 +8476,7 @@
                 <w:sz w:val="20"/>
                 <w:szCs w:val="20"/>
               </w:rPr>
-              <w:t xml:space="preserve">iOS Smart App Banner (method_smartbanner)</w:t>
+              <w:t xml:space="preserve">Bank 3 — iOS Smart App Banner (method_smartbanner)</w:t>
             </w:r>
           </w:p>
         </w:tc>
@@ -8591,7 +8604,7 @@
                 <w:sz w:val="20"/>
                 <w:szCs w:val="20"/>
               </w:rPr>
-              <w:t xml:space="preserve">Android explicit-package intent (method_explicit_intent)</w:t>
+              <w:t xml:space="preserve">Bank 4 — Android explicit-package intent (method_explicit_intent)</w:t>
             </w:r>
           </w:p>
         </w:tc>
@@ -8716,7 +8729,7 @@
                 <w:sz w:val="20"/>
                 <w:szCs w:val="20"/>
               </w:rPr>
-              <w:t xml:space="preserve">Deferred deep linking (method_deferred)</w:t>
+              <w:t xml:space="preserve">Bank 5 — Deferred deep linking (method_deferred)</w:t>
             </w:r>
           </w:p>
         </w:tc>

</xml_diff>

<commit_message>
Verify all 5 methods on the "wrong" platform too; document results
Built and installed every Android-only app on iOS and every iOS-only app
on Android (no code changes needed — each already declares zero URL
space on the platform it doesn't target), confirming live that:
- Bank 1/4 (Android-only) are completely invisible on iOS
- Bank 2/3 (iOS-only) are completely invisible on Android
- Bank 5 (deferred) genuinely works identically on both

Adds a "Cross-Platform Verification" table to both the deck (new slide)
and the Word doc (new subsection in Part 9), color-coded by outcome.

Co-Authored-By: Claude Sonnet 5 <noreply@anthropic.com>
</commit_message>
<xml_diff>
--- a/SGQR_Complete_Project_Documentation.docx
+++ b/SGQR_Complete_Project_Documentation.docx
@@ -8884,6 +8884,584 @@
                 <w:szCs w:val="21"/>
               </w:rPr>
               <w:t xml:space="preserve">Two of these methods (Verified Universal Links and the Smart App Banner) look correct in code and configuration but cannot fully succeed in this project's environment — not due to a bug, but because of real platform requirements (a paid Apple Developer account, and a published App Store listing) that a sideloaded demo cannot meet. Documenting that distinction — “correct but blocked by an external requirement” versus “broken” — is itself one of the more useful outcomes of building all five.</w:t>
+            </w:r>
+          </w:p>
+        </w:tc>
+      </w:tr>
+    </w:tbl>
+    <w:p>
+      <w:pPr>
+        <w:pStyle w:val="Heading2"/>
+        <w:spacing w:after="150" w:before="300"/>
+      </w:pPr>
+      <w:r>
+        <w:t xml:space="preserve">Cross-Platform Verification: Confirmed Live, Not Just Claimed</w:t>
+      </w:r>
+    </w:p>
+    <w:p>
+      <w:pPr>
+        <w:spacing w:after="160"/>
+      </w:pPr>
+      <w:r>
+        <w:rPr>
+          <w:rFonts w:ascii="Calibri" w:cs="Calibri" w:eastAsia="Calibri" w:hAnsi="Calibri"/>
+          <w:color w:val="1A2233"/>
+          <w:sz w:val="22"/>
+          <w:szCs w:val="22"/>
+        </w:rPr>
+        <w:t xml:space="preserve">Every platform-compatibility badge shown in each app was independently verified by installing that app on the “wrong” platform too and confirming what actually happens when the same link is tapped there. No code changes were needed to produce these results — each Android-only app already declares zero iOS URL space, and each iOS-only app already declares zero Android intent-filter, so the negative case falls out naturally rather than needing to be specially engineered.</w:t>
+      </w:r>
+    </w:p>
+    <w:p>
+      <w:pPr>
+        <w:spacing w:after="200"/>
+      </w:pPr>
+    </w:p>
+    <w:tbl>
+      <w:tblPr>
+        <w:tblW w:type="dxa" w:w="11200"/>
+        <w:tblBorders>
+          <w:top w:val="single" w:color="auto" w:sz="4"/>
+          <w:left w:val="single" w:color="auto" w:sz="4"/>
+          <w:bottom w:val="single" w:color="auto" w:sz="4"/>
+          <w:right w:val="single" w:color="auto" w:sz="4"/>
+          <w:insideH w:val="single" w:color="auto" w:sz="4"/>
+          <w:insideV w:val="single" w:color="auto" w:sz="4"/>
+        </w:tblBorders>
+      </w:tblPr>
+      <w:tblGrid>
+        <w:gridCol w:w="2200"/>
+        <w:gridCol w:w="4500"/>
+        <w:gridCol w:w="4500"/>
+      </w:tblGrid>
+      <w:tr>
+        <w:trPr>
+          <w:tblHeader/>
+        </w:trPr>
+        <w:tc>
+          <w:tcPr>
+            <w:tcW w:type="dxa" w:w="2200"/>
+            <w:shd w:fill="21295C" w:val="clear"/>
+            <w:tcMar>
+              <w:top w:type="dxa" w:w="100"/>
+              <w:left w:type="dxa" w:w="120"/>
+              <w:bottom w:type="dxa" w:w="100"/>
+              <w:right w:type="dxa" w:w="120"/>
+            </w:tcMar>
+            <w:vAlign w:val="top"/>
+          </w:tcPr>
+          <w:p>
+            <w:pPr/>
+            <w:r>
+              <w:rPr>
+                <w:rFonts w:ascii="Calibri" w:cs="Calibri" w:eastAsia="Calibri" w:hAnsi="Calibri"/>
+                <w:b/>
+                <w:bCs/>
+                <w:color w:val="FFFFFF"/>
+                <w:sz w:val="20"/>
+                <w:szCs w:val="20"/>
+              </w:rPr>
+              <w:t xml:space="preserve">App</w:t>
+            </w:r>
+          </w:p>
+        </w:tc>
+        <w:tc>
+          <w:tcPr>
+            <w:tcW w:type="dxa" w:w="4500"/>
+            <w:shd w:fill="21295C" w:val="clear"/>
+            <w:tcMar>
+              <w:top w:type="dxa" w:w="100"/>
+              <w:left w:type="dxa" w:w="120"/>
+              <w:bottom w:type="dxa" w:w="100"/>
+              <w:right w:type="dxa" w:w="120"/>
+            </w:tcMar>
+            <w:vAlign w:val="top"/>
+          </w:tcPr>
+          <w:p>
+            <w:pPr/>
+            <w:r>
+              <w:rPr>
+                <w:rFonts w:ascii="Calibri" w:cs="Calibri" w:eastAsia="Calibri" w:hAnsi="Calibri"/>
+                <w:b/>
+                <w:bCs/>
+                <w:color w:val="FFFFFF"/>
+                <w:sz w:val="20"/>
+                <w:szCs w:val="20"/>
+              </w:rPr>
+              <w:t xml:space="preserve">On Android</w:t>
+            </w:r>
+          </w:p>
+        </w:tc>
+        <w:tc>
+          <w:tcPr>
+            <w:tcW w:type="dxa" w:w="4500"/>
+            <w:shd w:fill="21295C" w:val="clear"/>
+            <w:tcMar>
+              <w:top w:type="dxa" w:w="100"/>
+              <w:left w:type="dxa" w:w="120"/>
+              <w:bottom w:type="dxa" w:w="100"/>
+              <w:right w:type="dxa" w:w="120"/>
+            </w:tcMar>
+            <w:vAlign w:val="top"/>
+          </w:tcPr>
+          <w:p>
+            <w:pPr/>
+            <w:r>
+              <w:rPr>
+                <w:rFonts w:ascii="Calibri" w:cs="Calibri" w:eastAsia="Calibri" w:hAnsi="Calibri"/>
+                <w:b/>
+                <w:bCs/>
+                <w:color w:val="FFFFFF"/>
+                <w:sz w:val="20"/>
+                <w:szCs w:val="20"/>
+              </w:rPr>
+              <w:t xml:space="preserve">On iOS</w:t>
+            </w:r>
+          </w:p>
+        </w:tc>
+      </w:tr>
+      <w:tr>
+        <w:tc>
+          <w:tcPr>
+            <w:tcW w:type="dxa" w:w="2200"/>
+            <w:tcMar>
+              <w:top w:type="dxa" w:w="100"/>
+              <w:left w:type="dxa" w:w="120"/>
+              <w:bottom w:type="dxa" w:w="100"/>
+              <w:right w:type="dxa" w:w="120"/>
+            </w:tcMar>
+            <w:vAlign w:val="top"/>
+          </w:tcPr>
+          <w:p>
+            <w:pPr/>
+            <w:r>
+              <w:rPr>
+                <w:rFonts w:ascii="Calibri" w:cs="Calibri" w:eastAsia="Calibri" w:hAnsi="Calibri"/>
+                <w:b/>
+                <w:bCs/>
+                <w:color w:val="1A2233"/>
+                <w:sz w:val="20"/>
+                <w:szCs w:val="20"/>
+              </w:rPr>
+              <w:t xml:space="preserve">Bank 1 — Verified App Links</w:t>
+            </w:r>
+          </w:p>
+        </w:tc>
+        <w:tc>
+          <w:tcPr>
+            <w:tcW w:type="dxa" w:w="4500"/>
+            <w:shd w:fill="E8F5F0" w:val="clear"/>
+            <w:tcMar>
+              <w:top w:type="dxa" w:w="100"/>
+              <w:left w:type="dxa" w:w="120"/>
+              <w:bottom w:type="dxa" w:w="100"/>
+              <w:right w:type="dxa" w:w="120"/>
+            </w:tcMar>
+            <w:vAlign w:val="top"/>
+          </w:tcPr>
+          <w:p>
+            <w:pPr/>
+            <w:r>
+              <w:rPr>
+                <w:rFonts w:ascii="Calibri" w:cs="Calibri" w:eastAsia="Calibri" w:hAnsi="Calibri"/>
+                <w:color w:val="1A2233"/>
+                <w:sz w:val="20"/>
+                <w:szCs w:val="20"/>
+              </w:rPr>
+              <w:t xml:space="preserve">Opens directly, zero prompt — verification confirmed via adb shell pm get-app-links.</w:t>
+            </w:r>
+          </w:p>
+        </w:tc>
+        <w:tc>
+          <w:tcPr>
+            <w:tcW w:type="dxa" w:w="4500"/>
+            <w:shd w:fill="FBEAEA" w:val="clear"/>
+            <w:tcMar>
+              <w:top w:type="dxa" w:w="100"/>
+              <w:left w:type="dxa" w:w="120"/>
+              <w:bottom w:type="dxa" w:w="100"/>
+              <w:right w:type="dxa" w:w="120"/>
+            </w:tcMar>
+            <w:vAlign w:val="top"/>
+          </w:tcPr>
+          <w:p>
+            <w:pPr/>
+            <w:r>
+              <w:rPr>
+                <w:rFonts w:ascii="Calibri" w:cs="Calibri" w:eastAsia="Calibri" w:hAnsi="Calibri"/>
+                <w:color w:val="1A2233"/>
+                <w:sz w:val="20"/>
+                <w:szCs w:val="20"/>
+              </w:rPr>
+              <w:t xml:space="preserve">Just a plain webpage. Bank 1 claims no iOS URL space at all, so it's never even considered a candidate.</w:t>
+            </w:r>
+          </w:p>
+        </w:tc>
+      </w:tr>
+      <w:tr>
+        <w:tc>
+          <w:tcPr>
+            <w:tcW w:type="dxa" w:w="2200"/>
+            <w:shd w:fill="F5F8FA" w:val="clear"/>
+            <w:tcMar>
+              <w:top w:type="dxa" w:w="100"/>
+              <w:left w:type="dxa" w:w="120"/>
+              <w:bottom w:type="dxa" w:w="100"/>
+              <w:right w:type="dxa" w:w="120"/>
+            </w:tcMar>
+            <w:vAlign w:val="top"/>
+          </w:tcPr>
+          <w:p>
+            <w:pPr/>
+            <w:r>
+              <w:rPr>
+                <w:rFonts w:ascii="Calibri" w:cs="Calibri" w:eastAsia="Calibri" w:hAnsi="Calibri"/>
+                <w:b/>
+                <w:bCs/>
+                <w:color w:val="1A2233"/>
+                <w:sz w:val="20"/>
+                <w:szCs w:val="20"/>
+              </w:rPr>
+              <w:t xml:space="preserve">Bank 2 — Verified Universal Links</w:t>
+            </w:r>
+          </w:p>
+        </w:tc>
+        <w:tc>
+          <w:tcPr>
+            <w:tcW w:type="dxa" w:w="4500"/>
+            <w:shd w:fill="FBEAEA" w:val="clear"/>
+            <w:tcMar>
+              <w:top w:type="dxa" w:w="100"/>
+              <w:left w:type="dxa" w:w="120"/>
+              <w:bottom w:type="dxa" w:w="100"/>
+              <w:right w:type="dxa" w:w="120"/>
+            </w:tcMar>
+            <w:vAlign w:val="top"/>
+          </w:tcPr>
+          <w:p>
+            <w:pPr/>
+            <w:r>
+              <w:rPr>
+                <w:rFonts w:ascii="Calibri" w:cs="Calibri" w:eastAsia="Calibri" w:hAnsi="Calibri"/>
+                <w:color w:val="1A2233"/>
+                <w:sz w:val="20"/>
+                <w:szCs w:val="20"/>
+              </w:rPr>
+              <w:t xml:space="preserve">Just opens Chrome. Bank 2 declares no Android intent-filter at all, so it's never even considered a candidate.</w:t>
+            </w:r>
+          </w:p>
+        </w:tc>
+        <w:tc>
+          <w:tcPr>
+            <w:tcW w:type="dxa" w:w="4500"/>
+            <w:shd w:fill="FBF3E8" w:val="clear"/>
+            <w:tcMar>
+              <w:top w:type="dxa" w:w="100"/>
+              <w:left w:type="dxa" w:w="120"/>
+              <w:bottom w:type="dxa" w:w="100"/>
+              <w:right w:type="dxa" w:w="120"/>
+            </w:tcMar>
+            <w:vAlign w:val="top"/>
+          </w:tcPr>
+          <w:p>
+            <w:pPr/>
+            <w:r>
+              <w:rPr>
+                <w:rFonts w:ascii="Calibri" w:cs="Calibri" w:eastAsia="Calibri" w:hAnsi="Calibri"/>
+                <w:color w:val="1A2233"/>
+                <w:sz w:val="20"/>
+                <w:szCs w:val="20"/>
+              </w:rPr>
+              <w:t xml:space="preserve">Reaches Safari with a manual “Open” banner rather than a silent handoff — the free-account ceiling documented earlier in this Part.</w:t>
+            </w:r>
+          </w:p>
+        </w:tc>
+      </w:tr>
+      <w:tr>
+        <w:tc>
+          <w:tcPr>
+            <w:tcW w:type="dxa" w:w="2200"/>
+            <w:tcMar>
+              <w:top w:type="dxa" w:w="100"/>
+              <w:left w:type="dxa" w:w="120"/>
+              <w:bottom w:type="dxa" w:w="100"/>
+              <w:right w:type="dxa" w:w="120"/>
+            </w:tcMar>
+            <w:vAlign w:val="top"/>
+          </w:tcPr>
+          <w:p>
+            <w:pPr/>
+            <w:r>
+              <w:rPr>
+                <w:rFonts w:ascii="Calibri" w:cs="Calibri" w:eastAsia="Calibri" w:hAnsi="Calibri"/>
+                <w:b/>
+                <w:bCs/>
+                <w:color w:val="1A2233"/>
+                <w:sz w:val="20"/>
+                <w:szCs w:val="20"/>
+              </w:rPr>
+              <w:t xml:space="preserve">Bank 3 — Smart App Banner</w:t>
+            </w:r>
+          </w:p>
+        </w:tc>
+        <w:tc>
+          <w:tcPr>
+            <w:tcW w:type="dxa" w:w="4500"/>
+            <w:shd w:fill="FBEAEA" w:val="clear"/>
+            <w:tcMar>
+              <w:top w:type="dxa" w:w="100"/>
+              <w:left w:type="dxa" w:w="120"/>
+              <w:bottom w:type="dxa" w:w="100"/>
+              <w:right w:type="dxa" w:w="120"/>
+            </w:tcMar>
+            <w:vAlign w:val="top"/>
+          </w:tcPr>
+          <w:p>
+            <w:pPr/>
+            <w:r>
+              <w:rPr>
+                <w:rFonts w:ascii="Calibri" w:cs="Calibri" w:eastAsia="Calibri" w:hAnsi="Calibri"/>
+                <w:color w:val="1A2233"/>
+                <w:sz w:val="20"/>
+                <w:szCs w:val="20"/>
+              </w:rPr>
+              <w:t xml:space="preserve">Just opens Chrome. Bank 3 declares no Android intent-filter at all, so it's never even considered a candidate.</w:t>
+            </w:r>
+          </w:p>
+        </w:tc>
+        <w:tc>
+          <w:tcPr>
+            <w:tcW w:type="dxa" w:w="4500"/>
+            <w:shd w:fill="FBF3E8" w:val="clear"/>
+            <w:tcMar>
+              <w:top w:type="dxa" w:w="100"/>
+              <w:left w:type="dxa" w:w="120"/>
+              <w:bottom w:type="dxa" w:w="100"/>
+              <w:right w:type="dxa" w:w="120"/>
+            </w:tcMar>
+            <w:vAlign w:val="top"/>
+          </w:tcPr>
+          <w:p>
+            <w:pPr/>
+            <w:r>
+              <w:rPr>
+                <w:rFonts w:ascii="Calibri" w:cs="Calibri" w:eastAsia="Calibri" w:hAnsi="Calibri"/>
+                <w:color w:val="1A2233"/>
+                <w:sz w:val="20"/>
+                <w:szCs w:val="20"/>
+              </w:rPr>
+              <w:t xml:space="preserve">Banner cannot render without a real App Store listing, as documented earlier in this Part.</w:t>
+            </w:r>
+          </w:p>
+        </w:tc>
+      </w:tr>
+      <w:tr>
+        <w:tc>
+          <w:tcPr>
+            <w:tcW w:type="dxa" w:w="2200"/>
+            <w:shd w:fill="F5F8FA" w:val="clear"/>
+            <w:tcMar>
+              <w:top w:type="dxa" w:w="100"/>
+              <w:left w:type="dxa" w:w="120"/>
+              <w:bottom w:type="dxa" w:w="100"/>
+              <w:right w:type="dxa" w:w="120"/>
+            </w:tcMar>
+            <w:vAlign w:val="top"/>
+          </w:tcPr>
+          <w:p>
+            <w:pPr/>
+            <w:r>
+              <w:rPr>
+                <w:rFonts w:ascii="Calibri" w:cs="Calibri" w:eastAsia="Calibri" w:hAnsi="Calibri"/>
+                <w:b/>
+                <w:bCs/>
+                <w:color w:val="1A2233"/>
+                <w:sz w:val="20"/>
+                <w:szCs w:val="20"/>
+              </w:rPr>
+              <w:t xml:space="preserve">Bank 4 — Explicit-Package Intent</w:t>
+            </w:r>
+          </w:p>
+        </w:tc>
+        <w:tc>
+          <w:tcPr>
+            <w:tcW w:type="dxa" w:w="4500"/>
+            <w:shd w:fill="E8F5F0" w:val="clear"/>
+            <w:tcMar>
+              <w:top w:type="dxa" w:w="100"/>
+              <w:left w:type="dxa" w:w="120"/>
+              <w:bottom w:type="dxa" w:w="100"/>
+              <w:right w:type="dxa" w:w="120"/>
+            </w:tcMar>
+            <w:vAlign w:val="top"/>
+          </w:tcPr>
+          <w:p>
+            <w:pPr/>
+            <w:r>
+              <w:rPr>
+                <w:rFonts w:ascii="Calibri" w:cs="Calibri" w:eastAsia="Calibri" w:hAnsi="Calibri"/>
+                <w:color w:val="1A2233"/>
+                <w:sz w:val="20"/>
+                <w:szCs w:val="20"/>
+              </w:rPr>
+              <w:t xml:space="preserve">Opens directly, zero prompt, confirmed via adb.</w:t>
+            </w:r>
+          </w:p>
+        </w:tc>
+        <w:tc>
+          <w:tcPr>
+            <w:tcW w:type="dxa" w:w="4500"/>
+            <w:shd w:fill="FBEAEA" w:val="clear"/>
+            <w:tcMar>
+              <w:top w:type="dxa" w:w="100"/>
+              <w:left w:type="dxa" w:w="120"/>
+              <w:bottom w:type="dxa" w:w="100"/>
+              <w:right w:type="dxa" w:w="120"/>
+            </w:tcMar>
+            <w:vAlign w:val="top"/>
+          </w:tcPr>
+          <w:p>
+            <w:pPr/>
+            <w:r>
+              <w:rPr>
+                <w:rFonts w:ascii="Calibri" w:cs="Calibri" w:eastAsia="Calibri" w:hAnsi="Calibri"/>
+                <w:color w:val="1A2233"/>
+                <w:sz w:val="20"/>
+                <w:szCs w:val="20"/>
+              </w:rPr>
+              <w:t xml:space="preserve">Just a plain webpage. Bank 4 claims no iOS URL space at all, so it's never even considered a candidate.</w:t>
+            </w:r>
+          </w:p>
+        </w:tc>
+      </w:tr>
+      <w:tr>
+        <w:tc>
+          <w:tcPr>
+            <w:tcW w:type="dxa" w:w="2200"/>
+            <w:tcMar>
+              <w:top w:type="dxa" w:w="100"/>
+              <w:left w:type="dxa" w:w="120"/>
+              <w:bottom w:type="dxa" w:w="100"/>
+              <w:right w:type="dxa" w:w="120"/>
+            </w:tcMar>
+            <w:vAlign w:val="top"/>
+          </w:tcPr>
+          <w:p>
+            <w:pPr/>
+            <w:r>
+              <w:rPr>
+                <w:rFonts w:ascii="Calibri" w:cs="Calibri" w:eastAsia="Calibri" w:hAnsi="Calibri"/>
+                <w:b/>
+                <w:bCs/>
+                <w:color w:val="1A2233"/>
+                <w:sz w:val="20"/>
+                <w:szCs w:val="20"/>
+              </w:rPr>
+              <w:t xml:space="preserve">Bank 5 — Deferred Linking</w:t>
+            </w:r>
+          </w:p>
+        </w:tc>
+        <w:tc>
+          <w:tcPr>
+            <w:tcW w:type="dxa" w:w="4500"/>
+            <w:shd w:fill="E8F5F0" w:val="clear"/>
+            <w:tcMar>
+              <w:top w:type="dxa" w:w="100"/>
+              <w:left w:type="dxa" w:w="120"/>
+              <w:bottom w:type="dxa" w:w="100"/>
+              <w:right w:type="dxa" w:w="120"/>
+            </w:tcMar>
+            <w:vAlign w:val="top"/>
+          </w:tcPr>
+          <w:p>
+            <w:pPr/>
+            <w:r>
+              <w:rPr>
+                <w:rFonts w:ascii="Calibri" w:cs="Calibri" w:eastAsia="Calibri" w:hAnsi="Calibri"/>
+                <w:color w:val="1A2233"/>
+                <w:sz w:val="20"/>
+                <w:szCs w:val="20"/>
+              </w:rPr>
+              <w:t xml:space="preserve">Correct token recovered from clipboard on first launch.</w:t>
+            </w:r>
+          </w:p>
+        </w:tc>
+        <w:tc>
+          <w:tcPr>
+            <w:tcW w:type="dxa" w:w="4500"/>
+            <w:shd w:fill="E8F5F0" w:val="clear"/>
+            <w:tcMar>
+              <w:top w:type="dxa" w:w="100"/>
+              <w:left w:type="dxa" w:w="120"/>
+              <w:bottom w:type="dxa" w:w="100"/>
+              <w:right w:type="dxa" w:w="120"/>
+            </w:tcMar>
+            <w:vAlign w:val="top"/>
+          </w:tcPr>
+          <w:p>
+            <w:pPr/>
+            <w:r>
+              <w:rPr>
+                <w:rFonts w:ascii="Calibri" w:cs="Calibri" w:eastAsia="Calibri" w:hAnsi="Calibri"/>
+                <w:color w:val="1A2233"/>
+                <w:sz w:val="20"/>
+                <w:szCs w:val="20"/>
+              </w:rPr>
+              <w:t xml:space="preserve">Correct token recovered from clipboard on first launch — identical behavior to Android.</w:t>
+            </w:r>
+          </w:p>
+        </w:tc>
+      </w:tr>
+    </w:tbl>
+    <w:p>
+      <w:pPr>
+        <w:spacing w:after="200"/>
+      </w:pPr>
+    </w:p>
+    <w:tbl>
+      <w:tblPr>
+        <w:tblW w:type="dxa" w:w="9400"/>
+      </w:tblPr>
+      <w:tblGrid>
+        <w:gridCol w:w="9400"/>
+      </w:tblGrid>
+      <w:tr>
+        <w:tc>
+          <w:tcPr>
+            <w:tcW w:type="dxa" w:w="9400"/>
+            <w:shd w:fill="E8F5F0" w:val="clear"/>
+            <w:tcMar>
+              <w:top w:type="dxa" w:w="160"/>
+              <w:left w:type="dxa" w:w="200"/>
+              <w:bottom w:type="dxa" w:w="160"/>
+              <w:right w:type="dxa" w:w="200"/>
+            </w:tcMar>
+          </w:tcPr>
+          <w:p>
+            <w:pPr>
+              <w:spacing w:after="80"/>
+            </w:pPr>
+            <w:r>
+              <w:rPr>
+                <w:rFonts w:ascii="Calibri" w:cs="Calibri" w:eastAsia="Calibri" w:hAnsi="Calibri"/>
+                <w:b/>
+                <w:bCs/>
+                <w:color w:val="0B3B44"/>
+                <w:sz w:val="22"/>
+                <w:szCs w:val="22"/>
+              </w:rPr>
+              <w:t xml:space="preserve">What this confirms</w:t>
+            </w:r>
+          </w:p>
+          <w:p>
+            <w:r>
+              <w:rPr>
+                <w:rFonts w:ascii="Calibri" w:cs="Calibri" w:eastAsia="Calibri" w:hAnsi="Calibri"/>
+                <w:color w:val="1A2233"/>
+                <w:sz w:val="21"/>
+                <w:szCs w:val="21"/>
+              </w:rPr>
+              <w:t xml:space="preserve">Bank 1 and Bank 4 (Android-only) are completely invisible to iOS — not degraded, not partially working, simply never considered. Bank 2 and Bank 3 (iOS-only) are equally invisible to Android. Only Bank 5's clipboard-based deferred linking genuinely works identically on both platforms, which is exactly what its “Android + iOS” badge claims. Every badge in this project is now backed by a live device test in both directions, not just a description of intended behavior.</w:t>
             </w:r>
           </w:p>
         </w:tc>

</xml_diff>

<commit_message>
Reposition conclusion + include unregistered link in all comparisons
- Moved "Why We Chose an Unregistered Link" to come AFTER the 5
  alternative method slides/section in both the deck and Word doc,
  reframed as a conclusion synthesized from having built and tested
  all 5 alternatives, rather than an early assertion.
- Added a "Unregistered link (Bank A/B/C)" row to both Cross-Platform
  Verification tables (deck slide + Word doc), so every method
  comparison in this project is now fully inclusive of all 6
  approaches, not just the 5 new ones.

Co-Authored-By: Claude Sonnet 5 <noreply@anthropic.com>
</commit_message>
<xml_diff>
--- a/SGQR_Complete_Project_Documentation.docx
+++ b/SGQR_Complete_Project_Documentation.docx
@@ -9043,6 +9043,84 @@
                 <w:sz w:val="20"/>
                 <w:szCs w:val="20"/>
               </w:rPr>
+              <w:t xml:space="preserve">Unregistered link (Bank A/B/C)</w:t>
+            </w:r>
+          </w:p>
+        </w:tc>
+        <w:tc>
+          <w:tcPr>
+            <w:tcW w:type="dxa" w:w="4500"/>
+            <w:shd w:fill="E8F5F0" w:val="clear"/>
+            <w:tcMar>
+              <w:top w:type="dxa" w:w="100"/>
+              <w:left w:type="dxa" w:w="120"/>
+              <w:bottom w:type="dxa" w:w="100"/>
+              <w:right w:type="dxa" w:w="120"/>
+            </w:tcMar>
+            <w:vAlign w:val="top"/>
+          </w:tcPr>
+          <w:p>
+            <w:pPr/>
+            <w:r>
+              <w:rPr>
+                <w:rFonts w:ascii="Calibri" w:cs="Calibri" w:eastAsia="Calibri" w:hAnsi="Calibri"/>
+                <w:color w:val="1A2233"/>
+                <w:sz w:val="20"/>
+                <w:szCs w:val="20"/>
+              </w:rPr>
+              <w:t xml:space="preserve">Native chooser — the real, working point of this project, not a fallback.</w:t>
+            </w:r>
+          </w:p>
+        </w:tc>
+        <w:tc>
+          <w:tcPr>
+            <w:tcW w:type="dxa" w:w="4500"/>
+            <w:shd w:fill="E8F5F0" w:val="clear"/>
+            <w:tcMar>
+              <w:top w:type="dxa" w:w="100"/>
+              <w:left w:type="dxa" w:w="120"/>
+              <w:bottom w:type="dxa" w:w="100"/>
+              <w:right w:type="dxa" w:w="120"/>
+            </w:tcMar>
+            <w:vAlign w:val="top"/>
+          </w:tcPr>
+          <w:p>
+            <w:pPr/>
+            <w:r>
+              <w:rPr>
+                <w:rFonts w:ascii="Calibri" w:cs="Calibri" w:eastAsia="Calibri" w:hAnsi="Calibri"/>
+                <w:color w:val="1A2233"/>
+                <w:sz w:val="20"/>
+                <w:szCs w:val="20"/>
+              </w:rPr>
+              <w:t xml:space="preserve">Web picker grid — the real, working point of this project, not a fallback.</w:t>
+            </w:r>
+          </w:p>
+        </w:tc>
+      </w:tr>
+      <w:tr>
+        <w:tc>
+          <w:tcPr>
+            <w:tcW w:type="dxa" w:w="2200"/>
+            <w:tcMar>
+              <w:top w:type="dxa" w:w="100"/>
+              <w:left w:type="dxa" w:w="120"/>
+              <w:bottom w:type="dxa" w:w="100"/>
+              <w:right w:type="dxa" w:w="120"/>
+            </w:tcMar>
+            <w:vAlign w:val="top"/>
+          </w:tcPr>
+          <w:p>
+            <w:pPr/>
+            <w:r>
+              <w:rPr>
+                <w:rFonts w:ascii="Calibri" w:cs="Calibri" w:eastAsia="Calibri" w:hAnsi="Calibri"/>
+                <w:b/>
+                <w:bCs/>
+                <w:color w:val="1A2233"/>
+                <w:sz w:val="20"/>
+                <w:szCs w:val="20"/>
+              </w:rPr>
               <w:t xml:space="preserve">Bank 1 — Verified App Links</w:t>
             </w:r>
           </w:p>
@@ -9462,6 +9540,95 @@
                 <w:szCs w:val="21"/>
               </w:rPr>
               <w:t xml:space="preserve">Bank 1 and Bank 4 (Android-only) are completely invisible to iOS — not degraded, not partially working, simply never considered. Bank 2 and Bank 3 (iOS-only) are equally invisible to Android. Only Bank 5's clipboard-based deferred linking genuinely works identically on both platforms, which is exactly what its “Android + iOS” badge claims. Every badge in this project is now backed by a live device test in both directions, not just a description of intended behavior.</w:t>
+            </w:r>
+          </w:p>
+        </w:tc>
+      </w:tr>
+    </w:tbl>
+    <w:p>
+      <w:pPr>
+        <w:pStyle w:val="Heading2"/>
+        <w:spacing w:after="150" w:before="300"/>
+      </w:pPr>
+      <w:r>
+        <w:t xml:space="preserve">Why Unregistered Link Still Wins</w:t>
+      </w:r>
+    </w:p>
+    <w:p>
+      <w:pPr>
+        <w:spacing w:after="160"/>
+      </w:pPr>
+      <w:r>
+        <w:rPr>
+          <w:rFonts w:ascii="Calibri" w:cs="Calibri" w:eastAsia="Calibri" w:hAnsi="Calibri"/>
+          <w:sz w:val="22"/>
+          <w:szCs w:val="22"/>
+        </w:rPr>
+        <w:t xml:space="preserve">Having now built, deployed, and tested all 5 alternative mechanisms in addition to the original approach, the comparison points to one conclusion: none of the 5 alternatives were ever going to solve this project's actual requirement — the same user flow, on both platforms, choosing from any of 3 banks. Each of them solves a narrower problem instead.</w:t>
+      </w:r>
+    </w:p>
+    <w:p>
+      <w:pPr>
+        <w:spacing w:after="160"/>
+      </w:pPr>
+      <w:r>
+        <w:rPr>
+          <w:rFonts w:ascii="Calibri" w:cs="Calibri" w:eastAsia="Calibri" w:hAnsi="Calibri"/>
+          <w:sz w:val="22"/>
+          <w:szCs w:val="22"/>
+        </w:rPr>
+        <w:t xml:space="preserve">Bank 1 and Bank 4 prove that verification or explicit naming can remove the chooser entirely — but only by settling on one app in advance, which defeats the "any of 3 banks" requirement outright. Bank 2 and Bank 3 show that iOS verification is real and can work, but only once external requirements (a paid developer account, a published App Store listing) are met — requirements outside this project's control. Bank 5 solves a completely different problem (routing content across an install gap), not the chooser/picker problem at all.</w:t>
+      </w:r>
+    </w:p>
+    <w:p>
+      <w:pPr>
+        <w:spacing w:after="200"/>
+      </w:pPr>
+    </w:p>
+    <w:tbl>
+      <w:tblPr>
+        <w:tblW w:type="dxa" w:w="9400"/>
+      </w:tblPr>
+      <w:tblGrid>
+        <w:gridCol w:w="9400"/>
+      </w:tblGrid>
+      <w:tr>
+        <w:tc>
+          <w:tcPr>
+            <w:tcW w:type="dxa" w:w="9400"/>
+            <w:shd w:fill="FBEAEA" w:val="clear"/>
+            <w:tcMar>
+              <w:top w:type="dxa" w:w="160"/>
+              <w:left w:type="dxa" w:w="200"/>
+              <w:bottom w:type="dxa" w:w="160"/>
+              <w:right w:type="dxa" w:w="200"/>
+            </w:tcMar>
+          </w:tcPr>
+          <w:p>
+            <w:pPr>
+              <w:spacing w:after="80"/>
+            </w:pPr>
+            <w:r>
+              <w:rPr>
+                <w:rFonts w:ascii="Calibri" w:cs="Calibri" w:eastAsia="Calibri" w:hAnsi="Calibri"/>
+                <w:b/>
+                <w:bCs/>
+                <w:color w:val="7A1F1F"/>
+                <w:sz w:val="22"/>
+                <w:szCs w:val="22"/>
+              </w:rPr>
+              <w:t xml:space="preserve">The conclusion</w:t>
+            </w:r>
+          </w:p>
+          <w:p>
+            <w:r>
+              <w:rPr>
+                <w:rFonts w:ascii="Calibri" w:cs="Calibri" w:eastAsia="Calibri" w:hAnsi="Calibri"/>
+                <w:color w:val="1A2233"/>
+                <w:sz w:val="21"/>
+                <w:szCs w:val="21"/>
+              </w:rPr>
+              <w:t xml:space="preserve">Unregistered link is not the option left over after the others were ruled out — it is the only one of these 6 approaches actually shaped around this project's specific requirement: the same outcome, reached the same way, regardless of which phone scans the code.</w:t>
             </w:r>
           </w:p>
         </w:tc>

</xml_diff>

<commit_message>
Reorder all 3 documents: methods first, unregistered link last
Unregistered link (Bank A/B/C) is this project's concluding solution,
so it now comes last everywhere a method comparison or narrative
sequence appears, with Bank 1-5 showcased first:

- Main deck: overview table, cross-platform table, and slide order all
  reordered (Bank 1-5 → core mechanism explanation → conclusion slide
  → closing).
- Word doc: both Part 9 comparison tables reordered the same way.
- Sequence deck: Bank 1 diagram + cross-platform negative case + the
  all-6-methods table now come first, with the 4 core sequence
  diagrams (Android chooser, iOS handoff, single-use approval, journey
  comparison) moved to the end.

Co-Authored-By: Claude Sonnet 5 <noreply@anthropic.com>
</commit_message>
<xml_diff>
--- a/SGQR_Complete_Project_Documentation.docx
+++ b/SGQR_Complete_Project_Documentation.docx
@@ -8079,6 +8079,7 @@
         <w:tc>
           <w:tcPr>
             <w:tcW w:type="dxa" w:w="1500"/>
+            <w:shd w:fill="F5F8FA" w:val="clear"/>
             <w:tcMar>
               <w:top w:type="dxa" w:w="100"/>
               <w:left w:type="dxa" w:w="120"/>
@@ -8098,13 +8099,14 @@
                 <w:sz w:val="20"/>
                 <w:szCs w:val="20"/>
               </w:rPr>
-              <w:t xml:space="preserve">Unregistered link (core approach — used by Bank A/B/C)</w:t>
+              <w:t xml:space="preserve">Bank 1 — Verified Android App Links (method_applinks)</w:t>
             </w:r>
           </w:p>
         </w:tc>
         <w:tc>
           <w:tcPr>
             <w:tcW w:type="dxa" w:w="2800"/>
+            <w:shd w:fill="F5F8FA" w:val="clear"/>
             <w:tcMar>
               <w:top w:type="dxa" w:w="100"/>
               <w:left w:type="dxa" w:w="120"/>
@@ -8122,13 +8124,14 @@
                 <w:sz w:val="20"/>
                 <w:szCs w:val="20"/>
               </w:rPr>
-              <w:t xml:space="preserve">QR encodes an unverified https link. Android defers to the browser then an intent:// forced chooser; iOS falls through to Safari's bank-tile grid.</w:t>
+              <w:t xml:space="preserve">android:autoVerify="true" plus a hosted assetlinks.json at /.well-known/assetlinks.json.</w:t>
             </w:r>
           </w:p>
         </w:tc>
         <w:tc>
           <w:tcPr>
             <w:tcW w:type="dxa" w:w="2200"/>
+            <w:shd w:fill="F5F8FA" w:val="clear"/>
             <w:tcMar>
               <w:top w:type="dxa" w:w="100"/>
               <w:left w:type="dxa" w:w="120"/>
@@ -8146,13 +8149,14 @@
                 <w:sz w:val="20"/>
                 <w:szCs w:val="20"/>
               </w:rPr>
-              <w:t xml:space="preserve">None.</w:t>
+              <w:t xml:space="preserve">Proof of domain ownership via the app's signing certificate fingerprint.</w:t>
             </w:r>
           </w:p>
         </w:tc>
         <w:tc>
           <w:tcPr>
             <w:tcW w:type="dxa" w:w="1200"/>
+            <w:shd w:fill="F5F8FA" w:val="clear"/>
             <w:tcMar>
               <w:top w:type="dxa" w:w="100"/>
               <w:left w:type="dxa" w:w="120"/>
@@ -8170,13 +8174,14 @@
                 <w:sz w:val="20"/>
                 <w:szCs w:val="20"/>
               </w:rPr>
-              <w:t xml:space="preserve">No — the chooser/picker is the whole point.</w:t>
+              <w:t xml:space="preserve">Yes — chooser skipped entirely.</w:t>
             </w:r>
           </w:p>
         </w:tc>
         <w:tc>
           <w:tcPr>
             <w:tcW w:type="dxa" w:w="3500"/>
+            <w:shd w:fill="F5F8FA" w:val="clear"/>
             <w:tcMar>
               <w:top w:type="dxa" w:w="100"/>
               <w:left w:type="dxa" w:w="120"/>
@@ -8194,7 +8199,7 @@
                 <w:sz w:val="20"/>
                 <w:szCs w:val="20"/>
               </w:rPr>
-              <w:t xml:space="preserve">Tested extensively across this project; working end to end on both platforms.</w:t>
+              <w:t xml:space="preserve">Tested live on a real Android device: verified via adb shell pm get-app-links, link opened the app directly with zero prompt.</w:t>
             </w:r>
           </w:p>
         </w:tc>
@@ -8203,6 +8208,130 @@
         <w:tc>
           <w:tcPr>
             <w:tcW w:type="dxa" w:w="1500"/>
+            <w:tcMar>
+              <w:top w:type="dxa" w:w="100"/>
+              <w:left w:type="dxa" w:w="120"/>
+              <w:bottom w:type="dxa" w:w="100"/>
+              <w:right w:type="dxa" w:w="120"/>
+            </w:tcMar>
+            <w:vAlign w:val="top"/>
+          </w:tcPr>
+          <w:p>
+            <w:pPr/>
+            <w:r>
+              <w:rPr>
+                <w:rFonts w:ascii="Calibri" w:cs="Calibri" w:eastAsia="Calibri" w:hAnsi="Calibri"/>
+                <w:b/>
+                <w:bCs/>
+                <w:color w:val="1A2233"/>
+                <w:sz w:val="20"/>
+                <w:szCs w:val="20"/>
+              </w:rPr>
+              <w:t xml:space="preserve">Bank 2 — Verified iOS Universal Links (method_universallinks)</w:t>
+            </w:r>
+          </w:p>
+        </w:tc>
+        <w:tc>
+          <w:tcPr>
+            <w:tcW w:type="dxa" w:w="2800"/>
+            <w:tcMar>
+              <w:top w:type="dxa" w:w="100"/>
+              <w:left w:type="dxa" w:w="120"/>
+              <w:bottom w:type="dxa" w:w="100"/>
+              <w:right w:type="dxa" w:w="120"/>
+            </w:tcMar>
+            <w:vAlign w:val="top"/>
+          </w:tcPr>
+          <w:p>
+            <w:pPr/>
+            <w:r>
+              <w:rPr>
+                <w:rFonts w:ascii="Calibri" w:cs="Calibri" w:eastAsia="Calibri" w:hAnsi="Calibri"/>
+                <w:color w:val="1A2233"/>
+                <w:sz w:val="20"/>
+                <w:szCs w:val="20"/>
+              </w:rPr>
+              <w:t xml:space="preserve">Associated Domains entitlement plus a hosted apple-app-site-association at /.well-known/apple-app-site-association.</w:t>
+            </w:r>
+          </w:p>
+        </w:tc>
+        <w:tc>
+          <w:tcPr>
+            <w:tcW w:type="dxa" w:w="2200"/>
+            <w:tcMar>
+              <w:top w:type="dxa" w:w="100"/>
+              <w:left w:type="dxa" w:w="120"/>
+              <w:bottom w:type="dxa" w:w="100"/>
+              <w:right w:type="dxa" w:w="120"/>
+            </w:tcMar>
+            <w:vAlign w:val="top"/>
+          </w:tcPr>
+          <w:p>
+            <w:pPr/>
+            <w:r>
+              <w:rPr>
+                <w:rFonts w:ascii="Calibri" w:cs="Calibri" w:eastAsia="Calibri" w:hAnsi="Calibri"/>
+                <w:color w:val="1A2233"/>
+                <w:sz w:val="20"/>
+                <w:szCs w:val="20"/>
+              </w:rPr>
+              <w:t xml:space="preserve">Associated Domains capability, which requires a paid Apple Developer Program membership for real verification.</w:t>
+            </w:r>
+          </w:p>
+        </w:tc>
+        <w:tc>
+          <w:tcPr>
+            <w:tcW w:type="dxa" w:w="1200"/>
+            <w:tcMar>
+              <w:top w:type="dxa" w:w="100"/>
+              <w:left w:type="dxa" w:w="120"/>
+              <w:bottom w:type="dxa" w:w="100"/>
+              <w:right w:type="dxa" w:w="120"/>
+            </w:tcMar>
+            <w:vAlign w:val="top"/>
+          </w:tcPr>
+          <w:p>
+            <w:pPr/>
+            <w:r>
+              <w:rPr>
+                <w:rFonts w:ascii="Calibri" w:cs="Calibri" w:eastAsia="Calibri" w:hAnsi="Calibri"/>
+                <w:color w:val="1A2233"/>
+                <w:sz w:val="20"/>
+                <w:szCs w:val="20"/>
+              </w:rPr>
+              <w:t xml:space="preserve">Intended: yes.</w:t>
+            </w:r>
+          </w:p>
+        </w:tc>
+        <w:tc>
+          <w:tcPr>
+            <w:tcW w:type="dxa" w:w="3500"/>
+            <w:tcMar>
+              <w:top w:type="dxa" w:w="100"/>
+              <w:left w:type="dxa" w:w="120"/>
+              <w:bottom w:type="dxa" w:w="100"/>
+              <w:right w:type="dxa" w:w="120"/>
+            </w:tcMar>
+            <w:vAlign w:val="top"/>
+          </w:tcPr>
+          <w:p>
+            <w:pPr/>
+            <w:r>
+              <w:rPr>
+                <w:rFonts w:ascii="Calibri" w:cs="Calibri" w:eastAsia="Calibri" w:hAnsi="Calibri"/>
+                <w:color w:val="1A2233"/>
+                <w:sz w:val="20"/>
+                <w:szCs w:val="20"/>
+              </w:rPr>
+              <w:t xml:space="preserve">Tested on a real iPhone with a free Apple ID: entitlement was present in the signed binary (confirmed via codesign), but iOS never created the “Open Links” per-app Settings entry — verification never actually completed. Every test fell through to Safari with a manual “Open” banner instead of a silent handoff. A real, confirmed limitation of free-tier accounts, not a code bug.</w:t>
+            </w:r>
+          </w:p>
+        </w:tc>
+      </w:tr>
+      <w:tr>
+        <w:tc>
+          <w:tcPr>
+            <w:tcW w:type="dxa" w:w="1500"/>
             <w:shd w:fill="F5F8FA" w:val="clear"/>
             <w:tcMar>
               <w:top w:type="dxa" w:w="100"/>
@@ -8223,7 +8352,7 @@
                 <w:sz w:val="20"/>
                 <w:szCs w:val="20"/>
               </w:rPr>
-              <w:t xml:space="preserve">Bank 1 — Verified Android App Links (method_applinks)</w:t>
+              <w:t xml:space="preserve">Bank 3 — iOS Smart App Banner (method_smartbanner)</w:t>
             </w:r>
           </w:p>
         </w:tc>
@@ -8248,7 +8377,7 @@
                 <w:sz w:val="20"/>
                 <w:szCs w:val="20"/>
               </w:rPr>
-              <w:t xml:space="preserve">android:autoVerify="true" plus a hosted assetlinks.json at /.well-known/assetlinks.json.</w:t>
+              <w:t xml:space="preserve">A &lt;meta name="apple-itunes-app"&gt; tag on a webpage, carrying an app-id and an app-argument.</w:t>
             </w:r>
           </w:p>
         </w:tc>
@@ -8273,7 +8402,7 @@
                 <w:sz w:val="20"/>
                 <w:szCs w:val="20"/>
               </w:rPr>
-              <w:t xml:space="preserve">Proof of domain ownership via the app's signing certificate fingerprint.</w:t>
+              <w:t xml:space="preserve">The app-id must match a real, published App Store listing — Apple validates this server-side, not just tag presence.</w:t>
             </w:r>
           </w:p>
         </w:tc>
@@ -8298,7 +8427,7 @@
                 <w:sz w:val="20"/>
                 <w:szCs w:val="20"/>
               </w:rPr>
-              <w:t xml:space="preserve">Yes — chooser skipped entirely.</w:t>
+              <w:t xml:space="preserve">No entitlement needed, but the banner cannot render at all without a real listing.</w:t>
             </w:r>
           </w:p>
         </w:tc>
@@ -8323,7 +8452,7 @@
                 <w:sz w:val="20"/>
                 <w:szCs w:val="20"/>
               </w:rPr>
-              <w:t xml:space="preserve">Tested live on a real Android device: verified via adb shell pm get-app-links, link opened the app directly with zero prompt.</w:t>
+              <w:t xml:space="preserve">Code and hosting confirmed correct and deployed, but the banner itself cannot appear for a sideloaded, unpublished app — a confirmed limitation, not testable further without publishing.</w:t>
             </w:r>
           </w:p>
         </w:tc>
@@ -8351,7 +8480,7 @@
                 <w:sz w:val="20"/>
                 <w:szCs w:val="20"/>
               </w:rPr>
-              <w:t xml:space="preserve">Bank 2 — Verified iOS Universal Links (method_universallinks)</w:t>
+              <w:t xml:space="preserve">Bank 4 — Android explicit-package intent (method_explicit_intent)</w:t>
             </w:r>
           </w:p>
         </w:tc>
@@ -8375,7 +8504,7 @@
                 <w:sz w:val="20"/>
                 <w:szCs w:val="20"/>
               </w:rPr>
-              <w:t xml:space="preserve">Associated Domains entitlement plus a hosted apple-app-site-association at /.well-known/apple-app-site-association.</w:t>
+              <w:t xml:space="preserve">An intent:// link with package=com.sgqrdemo.method_explicit_intent named directly, removing all ambiguity.</w:t>
             </w:r>
           </w:p>
         </w:tc>
@@ -8399,7 +8528,7 @@
                 <w:sz w:val="20"/>
                 <w:szCs w:val="20"/>
               </w:rPr>
-              <w:t xml:space="preserve">Associated Domains capability, which requires a paid Apple Developer Program membership for real verification.</w:t>
+              <w:t xml:space="preserve">None — the sender states the answer instead of the OS verifying it.</w:t>
             </w:r>
           </w:p>
         </w:tc>
@@ -8423,7 +8552,7 @@
                 <w:sz w:val="20"/>
                 <w:szCs w:val="20"/>
               </w:rPr>
-              <w:t xml:space="preserve">Intended: yes.</w:t>
+              <w:t xml:space="preserve">Yes — chooser skipped unconditionally.</w:t>
             </w:r>
           </w:p>
         </w:tc>
@@ -8447,7 +8576,7 @@
                 <w:sz w:val="20"/>
                 <w:szCs w:val="20"/>
               </w:rPr>
-              <w:t xml:space="preserve">Tested on a real iPhone with a free Apple ID: entitlement was present in the signed binary (confirmed via codesign), but iOS never created the “Open Links” per-app Settings entry — verification never actually completed. Every test fell through to Safari with a manual “Open” banner instead of a silent handoff. A real, confirmed limitation of free-tier accounts, not a code bug.</w:t>
+              <w:t xml:space="preserve">Tested live on a real Android device via adb: opened directly, zero prompt, correct payload fetched. Trade-off: only works when the link's generator already knows which app should open it — the opposite of this project's “any of 3 banks” scenario.</w:t>
             </w:r>
           </w:p>
         </w:tc>
@@ -8476,7 +8605,7 @@
                 <w:sz w:val="20"/>
                 <w:szCs w:val="20"/>
               </w:rPr>
-              <w:t xml:space="preserve">Bank 3 — iOS Smart App Banner (method_smartbanner)</w:t>
+              <w:t xml:space="preserve">Bank 5 — Deferred deep linking (method_deferred)</w:t>
             </w:r>
           </w:p>
         </w:tc>
@@ -8501,7 +8630,7 @@
                 <w:sz w:val="20"/>
                 <w:szCs w:val="20"/>
               </w:rPr>
-              <w:t xml:space="preserve">A &lt;meta name="apple-itunes-app"&gt; tag on a webpage, carrying an app-id and an app-argument.</w:t>
+              <w:t xml:space="preserve">Real deferred linking relies on the App/Play Store carrying a click identifier through installation itself. Simulated here via a clipboard technique: the web fallback copies the destination URL before the (simulated) “install” step, and the app checks the clipboard once on first launch.</w:t>
             </w:r>
           </w:p>
         </w:tc>
@@ -8526,7 +8655,7 @@
                 <w:sz w:val="20"/>
                 <w:szCs w:val="20"/>
               </w:rPr>
-              <w:t xml:space="preserve">The app-id must match a real, published App Store listing — Apple validates this server-side, not just tag presence.</w:t>
+              <w:t xml:space="preserve">None — a client-side simulation, not App Store-backed.</w:t>
             </w:r>
           </w:p>
         </w:tc>
@@ -8551,7 +8680,7 @@
                 <w:sz w:val="20"/>
                 <w:szCs w:val="20"/>
               </w:rPr>
-              <w:t xml:space="preserve">No entitlement needed, but the banner cannot render at all without a real listing.</w:t>
+              <w:t xml:space="preserve">N/A — this method is about post-install content routing, not chooser behavior.</w:t>
             </w:r>
           </w:p>
         </w:tc>
@@ -8576,7 +8705,7 @@
                 <w:sz w:val="20"/>
                 <w:szCs w:val="20"/>
               </w:rPr>
-              <w:t xml:space="preserve">Code and hosting confirmed correct and deployed, but the banner itself cannot appear for a sideloaded, unpublished app — a confirmed limitation, not testable further without publishing.</w:t>
+              <w:t xml:space="preserve">Tested live on both a real Android device and a real iPhone: correctly recovered the token, merchant, and amount from the clipboard on first launch on both platforms.</w:t>
             </w:r>
           </w:p>
         </w:tc>
@@ -8604,7 +8733,7 @@
                 <w:sz w:val="20"/>
                 <w:szCs w:val="20"/>
               </w:rPr>
-              <w:t xml:space="preserve">Bank 4 — Android explicit-package intent (method_explicit_intent)</w:t>
+              <w:t xml:space="preserve">Unregistered link (core approach — used by Bank A/B/C)</w:t>
             </w:r>
           </w:p>
         </w:tc>
@@ -8628,7 +8757,7 @@
                 <w:sz w:val="20"/>
                 <w:szCs w:val="20"/>
               </w:rPr>
-              <w:t xml:space="preserve">An intent:// link with package=com.sgqrdemo.method_explicit_intent named directly, removing all ambiguity.</w:t>
+              <w:t xml:space="preserve">QR encodes an unverified https link. Android defers to the browser then an intent:// forced chooser; iOS falls through to Safari's bank-tile grid.</w:t>
             </w:r>
           </w:p>
         </w:tc>
@@ -8652,7 +8781,7 @@
                 <w:sz w:val="20"/>
                 <w:szCs w:val="20"/>
               </w:rPr>
-              <w:t xml:space="preserve">None — the sender states the answer instead of the OS verifying it.</w:t>
+              <w:t xml:space="preserve">None.</w:t>
             </w:r>
           </w:p>
         </w:tc>
@@ -8676,7 +8805,7 @@
                 <w:sz w:val="20"/>
                 <w:szCs w:val="20"/>
               </w:rPr>
-              <w:t xml:space="preserve">Yes — chooser skipped unconditionally.</w:t>
+              <w:t xml:space="preserve">No — the chooser/picker is the whole point.</w:t>
             </w:r>
           </w:p>
         </w:tc>
@@ -8700,136 +8829,7 @@
                 <w:sz w:val="20"/>
                 <w:szCs w:val="20"/>
               </w:rPr>
-              <w:t xml:space="preserve">Tested live on a real Android device via adb: opened directly, zero prompt, correct payload fetched. Trade-off: only works when the link's generator already knows which app should open it — the opposite of this project's “any of 3 banks” scenario.</w:t>
-            </w:r>
-          </w:p>
-        </w:tc>
-      </w:tr>
-      <w:tr>
-        <w:tc>
-          <w:tcPr>
-            <w:tcW w:type="dxa" w:w="1500"/>
-            <w:shd w:fill="F5F8FA" w:val="clear"/>
-            <w:tcMar>
-              <w:top w:type="dxa" w:w="100"/>
-              <w:left w:type="dxa" w:w="120"/>
-              <w:bottom w:type="dxa" w:w="100"/>
-              <w:right w:type="dxa" w:w="120"/>
-            </w:tcMar>
-            <w:vAlign w:val="top"/>
-          </w:tcPr>
-          <w:p>
-            <w:pPr/>
-            <w:r>
-              <w:rPr>
-                <w:rFonts w:ascii="Calibri" w:cs="Calibri" w:eastAsia="Calibri" w:hAnsi="Calibri"/>
-                <w:b/>
-                <w:bCs/>
-                <w:color w:val="1A2233"/>
-                <w:sz w:val="20"/>
-                <w:szCs w:val="20"/>
-              </w:rPr>
-              <w:t xml:space="preserve">Bank 5 — Deferred deep linking (method_deferred)</w:t>
-            </w:r>
-          </w:p>
-        </w:tc>
-        <w:tc>
-          <w:tcPr>
-            <w:tcW w:type="dxa" w:w="2800"/>
-            <w:shd w:fill="F5F8FA" w:val="clear"/>
-            <w:tcMar>
-              <w:top w:type="dxa" w:w="100"/>
-              <w:left w:type="dxa" w:w="120"/>
-              <w:bottom w:type="dxa" w:w="100"/>
-              <w:right w:type="dxa" w:w="120"/>
-            </w:tcMar>
-            <w:vAlign w:val="top"/>
-          </w:tcPr>
-          <w:p>
-            <w:pPr/>
-            <w:r>
-              <w:rPr>
-                <w:rFonts w:ascii="Calibri" w:cs="Calibri" w:eastAsia="Calibri" w:hAnsi="Calibri"/>
-                <w:color w:val="1A2233"/>
-                <w:sz w:val="20"/>
-                <w:szCs w:val="20"/>
-              </w:rPr>
-              <w:t xml:space="preserve">Real deferred linking relies on the App/Play Store carrying a click identifier through installation itself. Simulated here via a clipboard technique: the web fallback copies the destination URL before the (simulated) “install” step, and the app checks the clipboard once on first launch.</w:t>
-            </w:r>
-          </w:p>
-        </w:tc>
-        <w:tc>
-          <w:tcPr>
-            <w:tcW w:type="dxa" w:w="2200"/>
-            <w:shd w:fill="F5F8FA" w:val="clear"/>
-            <w:tcMar>
-              <w:top w:type="dxa" w:w="100"/>
-              <w:left w:type="dxa" w:w="120"/>
-              <w:bottom w:type="dxa" w:w="100"/>
-              <w:right w:type="dxa" w:w="120"/>
-            </w:tcMar>
-            <w:vAlign w:val="top"/>
-          </w:tcPr>
-          <w:p>
-            <w:pPr/>
-            <w:r>
-              <w:rPr>
-                <w:rFonts w:ascii="Calibri" w:cs="Calibri" w:eastAsia="Calibri" w:hAnsi="Calibri"/>
-                <w:color w:val="1A2233"/>
-                <w:sz w:val="20"/>
-                <w:szCs w:val="20"/>
-              </w:rPr>
-              <w:t xml:space="preserve">None — a client-side simulation, not App Store-backed.</w:t>
-            </w:r>
-          </w:p>
-        </w:tc>
-        <w:tc>
-          <w:tcPr>
-            <w:tcW w:type="dxa" w:w="1200"/>
-            <w:shd w:fill="F5F8FA" w:val="clear"/>
-            <w:tcMar>
-              <w:top w:type="dxa" w:w="100"/>
-              <w:left w:type="dxa" w:w="120"/>
-              <w:bottom w:type="dxa" w:w="100"/>
-              <w:right w:type="dxa" w:w="120"/>
-            </w:tcMar>
-            <w:vAlign w:val="top"/>
-          </w:tcPr>
-          <w:p>
-            <w:pPr/>
-            <w:r>
-              <w:rPr>
-                <w:rFonts w:ascii="Calibri" w:cs="Calibri" w:eastAsia="Calibri" w:hAnsi="Calibri"/>
-                <w:color w:val="1A2233"/>
-                <w:sz w:val="20"/>
-                <w:szCs w:val="20"/>
-              </w:rPr>
-              <w:t xml:space="preserve">N/A — this method is about post-install content routing, not chooser behavior.</w:t>
-            </w:r>
-          </w:p>
-        </w:tc>
-        <w:tc>
-          <w:tcPr>
-            <w:tcW w:type="dxa" w:w="3500"/>
-            <w:shd w:fill="F5F8FA" w:val="clear"/>
-            <w:tcMar>
-              <w:top w:type="dxa" w:w="100"/>
-              <w:left w:type="dxa" w:w="120"/>
-              <w:bottom w:type="dxa" w:w="100"/>
-              <w:right w:type="dxa" w:w="120"/>
-            </w:tcMar>
-            <w:vAlign w:val="top"/>
-          </w:tcPr>
-          <w:p>
-            <w:pPr/>
-            <w:r>
-              <w:rPr>
-                <w:rFonts w:ascii="Calibri" w:cs="Calibri" w:eastAsia="Calibri" w:hAnsi="Calibri"/>
-                <w:color w:val="1A2233"/>
-                <w:sz w:val="20"/>
-                <w:szCs w:val="20"/>
-              </w:rPr>
-              <w:t xml:space="preserve">Tested live on both a real Android device and a real iPhone: correctly recovered the token, merchant, and amount from the clipboard on first launch on both platforms.</w:t>
+              <w:t xml:space="preserve">Tested extensively across this project; working end to end on both platforms.</w:t>
             </w:r>
           </w:p>
         </w:tc>
@@ -9043,7 +9043,7 @@
                 <w:sz w:val="20"/>
                 <w:szCs w:val="20"/>
               </w:rPr>
-              <w:t xml:space="preserve">Unregistered link (Bank A/B/C)</w:t>
+              <w:t xml:space="preserve">Bank 1 — Verified App Links</w:t>
             </w:r>
           </w:p>
         </w:tc>
@@ -9068,7 +9068,218 @@
                 <w:sz w:val="20"/>
                 <w:szCs w:val="20"/>
               </w:rPr>
-              <w:t xml:space="preserve">Native chooser — the real, working point of this project, not a fallback.</w:t>
+              <w:t xml:space="preserve">Opens directly, zero prompt — verification confirmed via adb shell pm get-app-links.</w:t>
+            </w:r>
+          </w:p>
+        </w:tc>
+        <w:tc>
+          <w:tcPr>
+            <w:tcW w:type="dxa" w:w="4500"/>
+            <w:shd w:fill="FBEAEA" w:val="clear"/>
+            <w:tcMar>
+              <w:top w:type="dxa" w:w="100"/>
+              <w:left w:type="dxa" w:w="120"/>
+              <w:bottom w:type="dxa" w:w="100"/>
+              <w:right w:type="dxa" w:w="120"/>
+            </w:tcMar>
+            <w:vAlign w:val="top"/>
+          </w:tcPr>
+          <w:p>
+            <w:pPr/>
+            <w:r>
+              <w:rPr>
+                <w:rFonts w:ascii="Calibri" w:cs="Calibri" w:eastAsia="Calibri" w:hAnsi="Calibri"/>
+                <w:color w:val="1A2233"/>
+                <w:sz w:val="20"/>
+                <w:szCs w:val="20"/>
+              </w:rPr>
+              <w:t xml:space="preserve">Just a plain webpage. Bank 1 has told iOS nothing about this link at all, so iOS never even thinks to check whether Bank 1 could open it.</w:t>
+            </w:r>
+          </w:p>
+        </w:tc>
+      </w:tr>
+      <w:tr>
+        <w:tc>
+          <w:tcPr>
+            <w:tcW w:type="dxa" w:w="2200"/>
+            <w:shd w:fill="F5F8FA" w:val="clear"/>
+            <w:tcMar>
+              <w:top w:type="dxa" w:w="100"/>
+              <w:left w:type="dxa" w:w="120"/>
+              <w:bottom w:type="dxa" w:w="100"/>
+              <w:right w:type="dxa" w:w="120"/>
+            </w:tcMar>
+            <w:vAlign w:val="top"/>
+          </w:tcPr>
+          <w:p>
+            <w:pPr/>
+            <w:r>
+              <w:rPr>
+                <w:rFonts w:ascii="Calibri" w:cs="Calibri" w:eastAsia="Calibri" w:hAnsi="Calibri"/>
+                <w:b/>
+                <w:bCs/>
+                <w:color w:val="1A2233"/>
+                <w:sz w:val="20"/>
+                <w:szCs w:val="20"/>
+              </w:rPr>
+              <w:t xml:space="preserve">Bank 2 — Verified Universal Links</w:t>
+            </w:r>
+          </w:p>
+        </w:tc>
+        <w:tc>
+          <w:tcPr>
+            <w:tcW w:type="dxa" w:w="4500"/>
+            <w:shd w:fill="FBEAEA" w:val="clear"/>
+            <w:tcMar>
+              <w:top w:type="dxa" w:w="100"/>
+              <w:left w:type="dxa" w:w="120"/>
+              <w:bottom w:type="dxa" w:w="100"/>
+              <w:right w:type="dxa" w:w="120"/>
+            </w:tcMar>
+            <w:vAlign w:val="top"/>
+          </w:tcPr>
+          <w:p>
+            <w:pPr/>
+            <w:r>
+              <w:rPr>
+                <w:rFonts w:ascii="Calibri" w:cs="Calibri" w:eastAsia="Calibri" w:hAnsi="Calibri"/>
+                <w:color w:val="1A2233"/>
+                <w:sz w:val="20"/>
+                <w:szCs w:val="20"/>
+              </w:rPr>
+              <w:t xml:space="preserve">Just opens Chrome. Bank 2 has told Android nothing about this link at all, so Android never even thinks to check whether Bank 2 could open it.</w:t>
+            </w:r>
+          </w:p>
+        </w:tc>
+        <w:tc>
+          <w:tcPr>
+            <w:tcW w:type="dxa" w:w="4500"/>
+            <w:shd w:fill="FBF3E8" w:val="clear"/>
+            <w:tcMar>
+              <w:top w:type="dxa" w:w="100"/>
+              <w:left w:type="dxa" w:w="120"/>
+              <w:bottom w:type="dxa" w:w="100"/>
+              <w:right w:type="dxa" w:w="120"/>
+            </w:tcMar>
+            <w:vAlign w:val="top"/>
+          </w:tcPr>
+          <w:p>
+            <w:pPr/>
+            <w:r>
+              <w:rPr>
+                <w:rFonts w:ascii="Calibri" w:cs="Calibri" w:eastAsia="Calibri" w:hAnsi="Calibri"/>
+                <w:color w:val="1A2233"/>
+                <w:sz w:val="20"/>
+                <w:szCs w:val="20"/>
+              </w:rPr>
+              <w:t xml:space="preserve">Reaches Safari with a manual “Open” banner rather than a silent handoff — the free-account ceiling documented earlier in this Part.</w:t>
+            </w:r>
+          </w:p>
+        </w:tc>
+      </w:tr>
+      <w:tr>
+        <w:tc>
+          <w:tcPr>
+            <w:tcW w:type="dxa" w:w="2200"/>
+            <w:tcMar>
+              <w:top w:type="dxa" w:w="100"/>
+              <w:left w:type="dxa" w:w="120"/>
+              <w:bottom w:type="dxa" w:w="100"/>
+              <w:right w:type="dxa" w:w="120"/>
+            </w:tcMar>
+            <w:vAlign w:val="top"/>
+          </w:tcPr>
+          <w:p>
+            <w:pPr/>
+            <w:r>
+              <w:rPr>
+                <w:rFonts w:ascii="Calibri" w:cs="Calibri" w:eastAsia="Calibri" w:hAnsi="Calibri"/>
+                <w:b/>
+                <w:bCs/>
+                <w:color w:val="1A2233"/>
+                <w:sz w:val="20"/>
+                <w:szCs w:val="20"/>
+              </w:rPr>
+              <w:t xml:space="preserve">Bank 3 — Smart App Banner</w:t>
+            </w:r>
+          </w:p>
+        </w:tc>
+        <w:tc>
+          <w:tcPr>
+            <w:tcW w:type="dxa" w:w="4500"/>
+            <w:shd w:fill="FBEAEA" w:val="clear"/>
+            <w:tcMar>
+              <w:top w:type="dxa" w:w="100"/>
+              <w:left w:type="dxa" w:w="120"/>
+              <w:bottom w:type="dxa" w:w="100"/>
+              <w:right w:type="dxa" w:w="120"/>
+            </w:tcMar>
+            <w:vAlign w:val="top"/>
+          </w:tcPr>
+          <w:p>
+            <w:pPr/>
+            <w:r>
+              <w:rPr>
+                <w:rFonts w:ascii="Calibri" w:cs="Calibri" w:eastAsia="Calibri" w:hAnsi="Calibri"/>
+                <w:color w:val="1A2233"/>
+                <w:sz w:val="20"/>
+                <w:szCs w:val="20"/>
+              </w:rPr>
+              <w:t xml:space="preserve">Just opens Chrome. Bank 3 has told Android nothing about this link at all, so Android never even thinks to check whether Bank 3 could open it.</w:t>
+            </w:r>
+          </w:p>
+        </w:tc>
+        <w:tc>
+          <w:tcPr>
+            <w:tcW w:type="dxa" w:w="4500"/>
+            <w:shd w:fill="FBF3E8" w:val="clear"/>
+            <w:tcMar>
+              <w:top w:type="dxa" w:w="100"/>
+              <w:left w:type="dxa" w:w="120"/>
+              <w:bottom w:type="dxa" w:w="100"/>
+              <w:right w:type="dxa" w:w="120"/>
+            </w:tcMar>
+            <w:vAlign w:val="top"/>
+          </w:tcPr>
+          <w:p>
+            <w:pPr/>
+            <w:r>
+              <w:rPr>
+                <w:rFonts w:ascii="Calibri" w:cs="Calibri" w:eastAsia="Calibri" w:hAnsi="Calibri"/>
+                <w:color w:val="1A2233"/>
+                <w:sz w:val="20"/>
+                <w:szCs w:val="20"/>
+              </w:rPr>
+              <w:t xml:space="preserve">Banner cannot render without a real App Store listing, as documented earlier in this Part.</w:t>
+            </w:r>
+          </w:p>
+        </w:tc>
+      </w:tr>
+      <w:tr>
+        <w:tc>
+          <w:tcPr>
+            <w:tcW w:type="dxa" w:w="2200"/>
+            <w:shd w:fill="F5F8FA" w:val="clear"/>
+            <w:tcMar>
+              <w:top w:type="dxa" w:w="100"/>
+              <w:left w:type="dxa" w:w="120"/>
+              <w:bottom w:type="dxa" w:w="100"/>
+              <w:right w:type="dxa" w:w="120"/>
+            </w:tcMar>
+            <w:vAlign w:val="top"/>
+          </w:tcPr>
+          <w:p>
+            <w:pPr/>
+            <w:r>
+              <w:rPr>
+                <w:rFonts w:ascii="Calibri" w:cs="Calibri" w:eastAsia="Calibri" w:hAnsi="Calibri"/>
+                <w:b/>
+                <w:bCs/>
+                <w:color w:val="1A2233"/>
+                <w:sz w:val="20"/>
+                <w:szCs w:val="20"/>
+              </w:rPr>
+              <w:t xml:space="preserve">Bank 4 — Explicit-Package Intent</w:t>
             </w:r>
           </w:p>
         </w:tc>
@@ -9093,7 +9304,32 @@
                 <w:sz w:val="20"/>
                 <w:szCs w:val="20"/>
               </w:rPr>
-              <w:t xml:space="preserve">Web picker grid — the real, working point of this project, not a fallback.</w:t>
+              <w:t xml:space="preserve">Opens directly, zero prompt, confirmed via adb.</w:t>
+            </w:r>
+          </w:p>
+        </w:tc>
+        <w:tc>
+          <w:tcPr>
+            <w:tcW w:type="dxa" w:w="4500"/>
+            <w:shd w:fill="FBEAEA" w:val="clear"/>
+            <w:tcMar>
+              <w:top w:type="dxa" w:w="100"/>
+              <w:left w:type="dxa" w:w="120"/>
+              <w:bottom w:type="dxa" w:w="100"/>
+              <w:right w:type="dxa" w:w="120"/>
+            </w:tcMar>
+            <w:vAlign w:val="top"/>
+          </w:tcPr>
+          <w:p>
+            <w:pPr/>
+            <w:r>
+              <w:rPr>
+                <w:rFonts w:ascii="Calibri" w:cs="Calibri" w:eastAsia="Calibri" w:hAnsi="Calibri"/>
+                <w:color w:val="1A2233"/>
+                <w:sz w:val="20"/>
+                <w:szCs w:val="20"/>
+              </w:rPr>
+              <w:t xml:space="preserve">Just a plain webpage. Bank 4 has told iOS nothing about this link at all, so iOS never even thinks to check whether Bank 4 could open it.</w:t>
             </w:r>
           </w:p>
         </w:tc>
@@ -9121,7 +9357,7 @@
                 <w:sz w:val="20"/>
                 <w:szCs w:val="20"/>
               </w:rPr>
-              <w:t xml:space="preserve">Bank 1 — Verified App Links</w:t>
+              <w:t xml:space="preserve">Bank 5 — Deferred Linking</w:t>
             </w:r>
           </w:p>
         </w:tc>
@@ -9146,14 +9382,14 @@
                 <w:sz w:val="20"/>
                 <w:szCs w:val="20"/>
               </w:rPr>
-              <w:t xml:space="preserve">Opens directly, zero prompt — verification confirmed via adb shell pm get-app-links.</w:t>
+              <w:t xml:space="preserve">Correct token recovered from clipboard on first launch.</w:t>
             </w:r>
           </w:p>
         </w:tc>
         <w:tc>
           <w:tcPr>
             <w:tcW w:type="dxa" w:w="4500"/>
-            <w:shd w:fill="FBEAEA" w:val="clear"/>
+            <w:shd w:fill="E8F5F0" w:val="clear"/>
             <w:tcMar>
               <w:top w:type="dxa" w:w="100"/>
               <w:left w:type="dxa" w:w="120"/>
@@ -9171,7 +9407,7 @@
                 <w:sz w:val="20"/>
                 <w:szCs w:val="20"/>
               </w:rPr>
-              <w:t xml:space="preserve">Just a plain webpage. Bank 1 has told iOS nothing about this link at all, so iOS never even thinks to check whether Bank 1 could open it.</w:t>
+              <w:t xml:space="preserve">Correct token recovered from clipboard on first launch — identical behavior to Android.</w:t>
             </w:r>
           </w:p>
         </w:tc>
@@ -9180,7 +9416,6 @@
         <w:tc>
           <w:tcPr>
             <w:tcW w:type="dxa" w:w="2200"/>
-            <w:shd w:fill="F5F8FA" w:val="clear"/>
             <w:tcMar>
               <w:top w:type="dxa" w:w="100"/>
               <w:left w:type="dxa" w:w="120"/>
@@ -9200,164 +9435,7 @@
                 <w:sz w:val="20"/>
                 <w:szCs w:val="20"/>
               </w:rPr>
-              <w:t xml:space="preserve">Bank 2 — Verified Universal Links</w:t>
-            </w:r>
-          </w:p>
-        </w:tc>
-        <w:tc>
-          <w:tcPr>
-            <w:tcW w:type="dxa" w:w="4500"/>
-            <w:shd w:fill="FBEAEA" w:val="clear"/>
-            <w:tcMar>
-              <w:top w:type="dxa" w:w="100"/>
-              <w:left w:type="dxa" w:w="120"/>
-              <w:bottom w:type="dxa" w:w="100"/>
-              <w:right w:type="dxa" w:w="120"/>
-            </w:tcMar>
-            <w:vAlign w:val="top"/>
-          </w:tcPr>
-          <w:p>
-            <w:pPr/>
-            <w:r>
-              <w:rPr>
-                <w:rFonts w:ascii="Calibri" w:cs="Calibri" w:eastAsia="Calibri" w:hAnsi="Calibri"/>
-                <w:color w:val="1A2233"/>
-                <w:sz w:val="20"/>
-                <w:szCs w:val="20"/>
-              </w:rPr>
-              <w:t xml:space="preserve">Just opens Chrome. Bank 2 has told Android nothing about this link at all, so Android never even thinks to check whether Bank 2 could open it.</w:t>
-            </w:r>
-          </w:p>
-        </w:tc>
-        <w:tc>
-          <w:tcPr>
-            <w:tcW w:type="dxa" w:w="4500"/>
-            <w:shd w:fill="FBF3E8" w:val="clear"/>
-            <w:tcMar>
-              <w:top w:type="dxa" w:w="100"/>
-              <w:left w:type="dxa" w:w="120"/>
-              <w:bottom w:type="dxa" w:w="100"/>
-              <w:right w:type="dxa" w:w="120"/>
-            </w:tcMar>
-            <w:vAlign w:val="top"/>
-          </w:tcPr>
-          <w:p>
-            <w:pPr/>
-            <w:r>
-              <w:rPr>
-                <w:rFonts w:ascii="Calibri" w:cs="Calibri" w:eastAsia="Calibri" w:hAnsi="Calibri"/>
-                <w:color w:val="1A2233"/>
-                <w:sz w:val="20"/>
-                <w:szCs w:val="20"/>
-              </w:rPr>
-              <w:t xml:space="preserve">Reaches Safari with a manual “Open” banner rather than a silent handoff — the free-account ceiling documented earlier in this Part.</w:t>
-            </w:r>
-          </w:p>
-        </w:tc>
-      </w:tr>
-      <w:tr>
-        <w:tc>
-          <w:tcPr>
-            <w:tcW w:type="dxa" w:w="2200"/>
-            <w:tcMar>
-              <w:top w:type="dxa" w:w="100"/>
-              <w:left w:type="dxa" w:w="120"/>
-              <w:bottom w:type="dxa" w:w="100"/>
-              <w:right w:type="dxa" w:w="120"/>
-            </w:tcMar>
-            <w:vAlign w:val="top"/>
-          </w:tcPr>
-          <w:p>
-            <w:pPr/>
-            <w:r>
-              <w:rPr>
-                <w:rFonts w:ascii="Calibri" w:cs="Calibri" w:eastAsia="Calibri" w:hAnsi="Calibri"/>
-                <w:b/>
-                <w:bCs/>
-                <w:color w:val="1A2233"/>
-                <w:sz w:val="20"/>
-                <w:szCs w:val="20"/>
-              </w:rPr>
-              <w:t xml:space="preserve">Bank 3 — Smart App Banner</w:t>
-            </w:r>
-          </w:p>
-        </w:tc>
-        <w:tc>
-          <w:tcPr>
-            <w:tcW w:type="dxa" w:w="4500"/>
-            <w:shd w:fill="FBEAEA" w:val="clear"/>
-            <w:tcMar>
-              <w:top w:type="dxa" w:w="100"/>
-              <w:left w:type="dxa" w:w="120"/>
-              <w:bottom w:type="dxa" w:w="100"/>
-              <w:right w:type="dxa" w:w="120"/>
-            </w:tcMar>
-            <w:vAlign w:val="top"/>
-          </w:tcPr>
-          <w:p>
-            <w:pPr/>
-            <w:r>
-              <w:rPr>
-                <w:rFonts w:ascii="Calibri" w:cs="Calibri" w:eastAsia="Calibri" w:hAnsi="Calibri"/>
-                <w:color w:val="1A2233"/>
-                <w:sz w:val="20"/>
-                <w:szCs w:val="20"/>
-              </w:rPr>
-              <w:t xml:space="preserve">Just opens Chrome. Bank 3 has told Android nothing about this link at all, so Android never even thinks to check whether Bank 3 could open it.</w:t>
-            </w:r>
-          </w:p>
-        </w:tc>
-        <w:tc>
-          <w:tcPr>
-            <w:tcW w:type="dxa" w:w="4500"/>
-            <w:shd w:fill="FBF3E8" w:val="clear"/>
-            <w:tcMar>
-              <w:top w:type="dxa" w:w="100"/>
-              <w:left w:type="dxa" w:w="120"/>
-              <w:bottom w:type="dxa" w:w="100"/>
-              <w:right w:type="dxa" w:w="120"/>
-            </w:tcMar>
-            <w:vAlign w:val="top"/>
-          </w:tcPr>
-          <w:p>
-            <w:pPr/>
-            <w:r>
-              <w:rPr>
-                <w:rFonts w:ascii="Calibri" w:cs="Calibri" w:eastAsia="Calibri" w:hAnsi="Calibri"/>
-                <w:color w:val="1A2233"/>
-                <w:sz w:val="20"/>
-                <w:szCs w:val="20"/>
-              </w:rPr>
-              <w:t xml:space="preserve">Banner cannot render without a real App Store listing, as documented earlier in this Part.</w:t>
-            </w:r>
-          </w:p>
-        </w:tc>
-      </w:tr>
-      <w:tr>
-        <w:tc>
-          <w:tcPr>
-            <w:tcW w:type="dxa" w:w="2200"/>
-            <w:shd w:fill="F5F8FA" w:val="clear"/>
-            <w:tcMar>
-              <w:top w:type="dxa" w:w="100"/>
-              <w:left w:type="dxa" w:w="120"/>
-              <w:bottom w:type="dxa" w:w="100"/>
-              <w:right w:type="dxa" w:w="120"/>
-            </w:tcMar>
-            <w:vAlign w:val="top"/>
-          </w:tcPr>
-          <w:p>
-            <w:pPr/>
-            <w:r>
-              <w:rPr>
-                <w:rFonts w:ascii="Calibri" w:cs="Calibri" w:eastAsia="Calibri" w:hAnsi="Calibri"/>
-                <w:b/>
-                <w:bCs/>
-                <w:color w:val="1A2233"/>
-                <w:sz w:val="20"/>
-                <w:szCs w:val="20"/>
-              </w:rPr>
-              <w:t xml:space="preserve">Bank 4 — Explicit-Package Intent</w:t>
+              <w:t xml:space="preserve">Unregistered link (Bank A/B/C)</w:t>
             </w:r>
           </w:p>
         </w:tc>
@@ -9382,60 +9460,7 @@
                 <w:sz w:val="20"/>
                 <w:szCs w:val="20"/>
               </w:rPr>
-              <w:t xml:space="preserve">Opens directly, zero prompt, confirmed via adb.</w:t>
-            </w:r>
-          </w:p>
-        </w:tc>
-        <w:tc>
-          <w:tcPr>
-            <w:tcW w:type="dxa" w:w="4500"/>
-            <w:shd w:fill="FBEAEA" w:val="clear"/>
-            <w:tcMar>
-              <w:top w:type="dxa" w:w="100"/>
-              <w:left w:type="dxa" w:w="120"/>
-              <w:bottom w:type="dxa" w:w="100"/>
-              <w:right w:type="dxa" w:w="120"/>
-            </w:tcMar>
-            <w:vAlign w:val="top"/>
-          </w:tcPr>
-          <w:p>
-            <w:pPr/>
-            <w:r>
-              <w:rPr>
-                <w:rFonts w:ascii="Calibri" w:cs="Calibri" w:eastAsia="Calibri" w:hAnsi="Calibri"/>
-                <w:color w:val="1A2233"/>
-                <w:sz w:val="20"/>
-                <w:szCs w:val="20"/>
-              </w:rPr>
-              <w:t xml:space="preserve">Just a plain webpage. Bank 4 has told iOS nothing about this link at all, so iOS never even thinks to check whether Bank 4 could open it.</w:t>
-            </w:r>
-          </w:p>
-        </w:tc>
-      </w:tr>
-      <w:tr>
-        <w:tc>
-          <w:tcPr>
-            <w:tcW w:type="dxa" w:w="2200"/>
-            <w:tcMar>
-              <w:top w:type="dxa" w:w="100"/>
-              <w:left w:type="dxa" w:w="120"/>
-              <w:bottom w:type="dxa" w:w="100"/>
-              <w:right w:type="dxa" w:w="120"/>
-            </w:tcMar>
-            <w:vAlign w:val="top"/>
-          </w:tcPr>
-          <w:p>
-            <w:pPr/>
-            <w:r>
-              <w:rPr>
-                <w:rFonts w:ascii="Calibri" w:cs="Calibri" w:eastAsia="Calibri" w:hAnsi="Calibri"/>
-                <w:b/>
-                <w:bCs/>
-                <w:color w:val="1A2233"/>
-                <w:sz w:val="20"/>
-                <w:szCs w:val="20"/>
-              </w:rPr>
-              <w:t xml:space="preserve">Bank 5 — Deferred Linking</w:t>
+              <w:t xml:space="preserve">Native chooser — the real, working point of this project, not a fallback.</w:t>
             </w:r>
           </w:p>
         </w:tc>
@@ -9460,32 +9485,7 @@
                 <w:sz w:val="20"/>
                 <w:szCs w:val="20"/>
               </w:rPr>
-              <w:t xml:space="preserve">Correct token recovered from clipboard on first launch.</w:t>
-            </w:r>
-          </w:p>
-        </w:tc>
-        <w:tc>
-          <w:tcPr>
-            <w:tcW w:type="dxa" w:w="4500"/>
-            <w:shd w:fill="E8F5F0" w:val="clear"/>
-            <w:tcMar>
-              <w:top w:type="dxa" w:w="100"/>
-              <w:left w:type="dxa" w:w="120"/>
-              <w:bottom w:type="dxa" w:w="100"/>
-              <w:right w:type="dxa" w:w="120"/>
-            </w:tcMar>
-            <w:vAlign w:val="top"/>
-          </w:tcPr>
-          <w:p>
-            <w:pPr/>
-            <w:r>
-              <w:rPr>
-                <w:rFonts w:ascii="Calibri" w:cs="Calibri" w:eastAsia="Calibri" w:hAnsi="Calibri"/>
-                <w:color w:val="1A2233"/>
-                <w:sz w:val="20"/>
-                <w:szCs w:val="20"/>
-              </w:rPr>
-              <w:t xml:space="preserve">Correct token recovered from clipboard on first launch — identical behavior to Android.</w:t>
+              <w:t xml:space="preserve">Web picker grid — the real, working point of this project, not a fallback.</w:t>
             </w:r>
           </w:p>
         </w:tc>

</xml_diff>